<commit_message>
docs(patent): refine two-tier claims, add algorithmic flowchart, and clean up factual metrics
</commit_message>
<xml_diff>
--- a/docs/Meantendo_University_Patent_Submission.docx
+++ b/docs/Meantendo_University_Patent_Submission.docx
@@ -31,7 +31,7 @@
     </w:p>
     <w:p>
       <w:pPr>
-        <w:spacing w:after="200"/>
+        <w:spacing w:after="160"/>
       </w:pPr>
     </w:p>
     <w:p>
@@ -204,7 +204,7 @@
           <w:b/>
           <w:sz w:val="24"/>
         </w:rPr>
-        <w:t>An Apparatus and Method for Kinematic Transducer Signal Conditioning and Deterministic Ad-Hoc RF Telemetry in an Embedded Interactive Controller</w:t>
+        <w:t>An Apparatus and Method for Kinematic Transducer Signal Conditioning and Low-Latency Telemetry in an Interactive Computing System</w:t>
       </w:r>
     </w:p>
     <w:p>
@@ -240,7 +240,7 @@
     </w:p>
     <w:p>
       <w:r>
-        <w:t>An embedded interactive computing apparatus and method are disclosed that eliminate mechanical recoil overshoots on spring-biased analog potentiometric transducers while providing sub-2 millisecond deterministic peer-to-peer radio frequency (RF) telemetry. The apparatus comprises a dual-axis spring-centered resistive transducer, an analog-to-digital converter (ADC), a graphic display coupled via a serial peripheral interface, an RF transceiver, and a microcontroller unit. The microcontroller estimates real-time finite-difference kinematic displacement velocities of the transducer. Upon detecting a rapid return toward the neutral axis followed by an axis sign reversal, an asymmetric damping filter dynamically suppresses opposing directional recoil during a calibrated temporal window (20–50 ms) while preserving instantaneous passthrough for outward operator inputs. Conditioned coordinate matrices and entity states are serialized into fixed-length action frames and transmitted over an ad-hoc, unassociated RF channel with automated baseband channel-lock recovery, enabling deterministic low-latency multi-device synchronization without network infrastructure.</w:t>
+        <w:t>An embedded interactive computing apparatus and method are disclosed that eliminate mechanical recoil overshoots on spring-biased analog potentiometric transducers while providing sub-2 millisecond physical RF airtime telemetry. The apparatus comprises a dual-axis spring-centered resistive transducer, an analog-to-digital converter (ADC), a graphic display coupled via a serial peripheral interface, an RF transceiver, and a processing unit. The processing unit estimates real-time finite-difference kinematic displacement velocities of the transducer. Upon detecting a rapid return toward the neutral axis followed by an axis sign reversal, an asymmetric directional damping filter suppresses opposing directional recoil to neutral center during a calibrated temporal window (20–50 ms) while preserving instantaneous passthrough for outward operator inputs. Conditioned coordinate matrices are serialized into fixed-length action frames and broadcast over an unassociated RF channel with automated baseband channel-lock recovery, while display scanlines are rendered using dual line buffers (640 bytes total) to free system RAM for concurrent RF baseband operations.</w:t>
       </w:r>
     </w:p>
     <w:p>
@@ -257,19 +257,19 @@
     </w:p>
     <w:p>
       <w:r>
-        <w:t>In analog potentiometric joysticks and thumbstick gimbals biased by mechanical restorative springs, releasing a deflected stick causes the internal spring to snap back toward the neutral center. Due to underdamped mechanical inertia, the stick overshoots across the neutral axis into the opposing quadrant before settling ('mechanical snapback'). In precision human-machine interfaces, gaming controllers, and robotic manipulators, this physical bounce registers catastrophic false actuations in the opposite direction.</w:t>
-        <w:br/>
-        <w:br/>
-        <w:t>Furthermore, local multi-device interactive computing systems conventionally rely on standard Wi-Fi infrastructure (TCP/IP over Access Points) or Bluetooth Human Interface Device (HID) profiles. TCP/IP introduces 40–80ms of network stack latency and packet jitter, while Wi-Fi cloud updates (e.g., Over-the-Air firmware downloads) cause frequency-channel drift, rendering peer devices deaf to ad-hoc local mesh frames upon disconnection.</w:t>
+        <w:t>In analog potentiometric joysticks and thumbstick gimbals biased by mechanical restorative springs, releasing a deflected stick causes the internal spring to snap back toward the neutral center. Due to underdamped mechanical inertia, the stick overshoots across the neutral axis into the opposing quadrant before settling ('mechanical snapback'). In precision human-machine interfaces, gaming controllers, and robotic manipulators, this physical bounce registers unintended directional commands in the opposite direction.</w:t>
         <w:br/>
         <w:br/>
         <w:t>Existing Solutions and Their Deficiencies:</w:t>
         <w:br/>
         <w:t>1. Passive Analog Hardware Filters: Soldering ceramic capacitors (220nF–1µF) across potentiometer wipers creates an analog RC low-pass filter that absorbs spikes but introduces 15–30ms of input phase lag, degrading user reaction times.</w:t>
         <w:br/>
-        <w:t>2. Software Deadzone Inflation: Expanding software deadzones prevents snapback only by sacrificing fine-grained control near the center, making small corrections impossible.</w:t>
+        <w:t>2. Software Deadzone Inflation: Expanding software deadzones prevents snapback only by masking large portions of the transducer's physical travel, sacrificing fine-grained control near the center.</w:t>
         <w:br/>
-        <w:t>3. Contactless Sensors (Hall Effect / Magnetoresistive): While immune to carbon wear, contactless sensors are expensive and still suffer from the mechanical spring momentum of the physical stick, requiring costly mechanical damping greases or active magnetorheological fluids.</w:t>
+        <w:t>3. Contactless Sensors: While immune to carbon wiper wear, contactless Hall-effect sensors do not alter the physical momentum of the spring-loaded plastic stick, still requiring costly mechanical damping greases or active fluid assemblies.</w:t>
+        <w:br/>
+        <w:br/>
+        <w:t>Furthermore, local multi-device interactive computing systems conventionally rely on standard Wi-Fi infrastructure (TCP/IP over Access Points). TCP/IP introduces 40–80ms of network stack latency and packet jitter. Conversely, while low-overhead ad-hoc physical layer frames (e.g., 802.11 action frames) achieve low airtime, they are strictly channel-bound. Disconnecting from an internet-connected access point post-OTA update causes frequency-channel drift, rendering peer devices deaf to one another.</w:t>
       </w:r>
     </w:p>
     <w:p>
@@ -292,24 +292,24 @@
         <w:br/>
         <w:t>2. Display Pipeline: A 160x128 16-bit color TFT display driven via a high-speed Serial Peripheral Interface (SPI) bus at 27 MHz.</w:t>
         <w:br/>
-        <w:t>3. Ad-Hoc RF Transceiver: An internal 2.4 GHz 802.11 physical layer transceiver configured for peer-to-peer vendor-specific action frames (ESP-NOW) locked to a fixed 2.412 GHz carrier (Channel 1).</w:t>
+        <w:t>3. Ad-Hoc RF Transceiver: An internal 2.4 GHz 802.11 physical layer transceiver configured for peer-to-peer vendor-specific action frames locked to a dedicated 2.412 GHz carrier (Channel 1).</w:t>
         <w:br/>
-        <w:t>4. Power &amp; Memory Domains: An internal 8 KB Real-Time Clock (RTC) Fast/Slow SRAM domain maintaining memory retention during deep sleep (10µA quiescent draw), and a hardware cryptographic co-processor (SHA-256 and True Random Number Generator).</w:t>
+        <w:t>4. Power &amp; Memory Domains: An internal 8 KB Real-Time Clock (RTC) Fast/Slow SRAM domain maintaining state retention during deep sleep (11.2µA quiescent draw on the core module).</w:t>
         <w:br/>
         <w:br/>
         <w:t>Kinematic Derivative Rebound Suppression Algorithm:</w:t>
         <w:br/>
-        <w:t>The firmware executes a discrete state-machine updating at the ADC sampling interval (dt = 1–16 ms). It computes the instantaneous finite-difference velocity vector v = (x[n] - x[n-1]) / dt. When stick displacement exceeds 800 ADC counts from center, origin quadrant is latched. When stick returns toward center with velocity exceeding 25 counts/ms, fast return is flagged. If the coordinate crosses neutral deadzone into the opposite quadrant, rebound state is engaged for 50ms, clamping coordinates to neutral 2048 to prevent false input, while outward operator force exceeding 1300 counts aborts suppression with 0ms latency.</w:t>
+        <w:t>The firmware executes a discrete state-machine updating at periodic sampling intervals (dt = 1–16 ms). It computes the instantaneous finite-difference velocity vector v = (x[n] - x[n-1]) / dt. When stick displacement exceeds 800 ADC counts from center, origin quadrant is latched. When stick returns toward center with velocity exceeding 25 counts/ms, fast return is flagged. If the coordinate crosses neutral deadzone into the opposite quadrant, rebound state is engaged for 50ms, clamping coordinates to neutral 2048 to prevent false input, while outward operator force exceeding 1300 counts aborts suppression with 0ms latency.</w:t>
         <w:br/>
         <w:br/>
-        <w:t>Deterministic RF Telemetry &amp; Coexistence Channel Lock:</w:t>
+        <w:t>Synergistic Telemetry &amp; Coexistence Channel Lock:</w:t>
         <w:br/>
-        <w:t>The RF subsystem formats conditioned coordinates, switch bitmasks, and interactive entity states into a compact 20-byte packed telemetry frame (MeantendoTelemetry) with cyclic checksum. Carrier frequency is locked to Channel 1. Upon executing cloud network tasks (e.g., connecting to a router AP for firmware OTA updates), the firmware automatically purges IP network associations, reinitializes the station PHY layer, and restores the Channel 1 hardware lock, eliminating channel-drift deafness.</w:t>
+        <w:t>The RF subsystem formats conditioned coordinates, switch bitmasks, and interactive entity states into a compact 20-byte packed telemetry frame broadcast at 60 Hz on Channel 1 with sub-2ms physical airtime. Upon executing cloud network tasks (e.g., connecting to a router AP for firmware OTA updates), the firmware automatically purges IP network associations, reinitializes the station PHY layer, and restores the Channel 1 hardware lock, eliminating channel-drift deafness.</w:t>
         <w:br/>
         <w:br/>
-        <w:t>Zero-Buffer Line Rasterization &amp; Dirty-Span Tracking:</w:t>
+        <w:t>Zero-Buffer Line Rasterization &amp; Memory Headroom:</w:t>
         <w:br/>
-        <w:t>Rather than allocating a 40,960-byte full display frame buffer, the rendering engine allocates dual alternating 320-byte line buffers (640 bytes total). Moving entities are tracked in a 16-element bounded dirty-span queue. During frame refresh, targeted background erasures are executed exclusively on previously registered dirty bounds prior to drawing new positions, reducing SPI bus utilization by up to 90%.</w:t>
+        <w:t>Rather than allocating a 40,960-byte full display frame buffer, the rendering engine allocates dual alternating 320-byte line buffers (640 bytes total). Moving entities are tracked in a 16-element bounded dirty-span queue. This achieves a 98.44% memory reduction, preserving internal SRAM for concurrent RF radio packet queues and Bluetooth stacks.</w:t>
       </w:r>
     </w:p>
     <w:p>
@@ -326,23 +326,25 @@
     </w:p>
     <w:p>
       <w:r>
-        <w:t>The physical prototype was constructed and empirically characterized across 10,000+ operational cycles:</w:t>
+        <w:t>The physical prototype was constructed and empirically characterized across multi-session operational cycles:</w:t>
         <w:br/>
         <w:br/>
         <w:t>1. Snapback Suppression Verification:</w:t>
         <w:br/>
-        <w:t xml:space="preserve">   - Procedure: Mechanical thumbstick deflected to maximum deflection (ADC 4095) and released instantaneously ('flick test').</w:t>
+        <w:t xml:space="preserve">   - Procedure: Mechanical thumbstick deflected to maximum deflection (ADC 4095) and released abruptly ('flick test').</w:t>
         <w:br/>
         <w:t xml:space="preserve">   - Baseline without Filter: Spring recoil caused voltage bounce to ADC 1200 (overshoot of 848 counts past center 2048), registering false reverse actuation.</w:t>
         <w:br/>
-        <w:t xml:space="preserve">   - With Invention: Recoil detected within 2ms of zero-crossing; clamped to 2048 for exactly 50ms; zero false actuations; outward player responsiveness preserved with 0ms delay.</w:t>
+        <w:t xml:space="preserve">   - With Invention: Recoil detected within 2ms of deadzone entry; clamped to 2048 for exactly 50ms; zero false actuations; outward player responsiveness preserved with 0ms delay.</w:t>
         <w:br/>
         <w:br/>
-        <w:t>2. RF Telemetry Throughput &amp; Latency Characterization:</w:t>
+        <w:t>2. RF Telemetry Airtime Characterization:</w:t>
         <w:br/>
-        <w:t xml:space="preserve">   - Procedure: 60 Hz bidirectional telemetry exchange between primary handheld console and secondary companion node over ESP-NOW Channel 1.</w:t>
+        <w:t xml:space="preserve">   - Procedure: 60 Hz bidirectional telemetry exchange between primary handheld console and secondary companion node over dedicated Channel 1.</w:t>
         <w:br/>
-        <w:t xml:space="preserve">   - Empirical Log Results: Successfully transmitted 4,426 frames and received 5,456 frames without packet collisions or drops. Average end-to-end airtime latency measured at 1.42 ms (sub-2ms deterministic performance).</w:t>
+        <w:t xml:space="preserve">   - Physical Airtime: One-way packet transmission airtime across the air measured at 1.42 ms average, ensuring sub-frame packet delivery within the 16.7 ms frame interval of a 60 Hz interactive loop.</w:t>
+        <w:br/>
+        <w:t xml:space="preserve">   - Throughput: Sustained concurrent transmission of 20-byte packed telemetry frames across continuous multi-minute interactive sessions.</w:t>
         <w:br/>
         <w:br/>
         <w:t>3. RAM Optimization Benchmark:</w:t>
@@ -354,11 +356,11 @@
         <w:t xml:space="preserve">   - RAM Savings: 98.44% reduction, enabling concurrent operation of NimBLE Bluetooth stack, Wi-Fi PHY layer, and game logic without heap exhaustion.</w:t>
         <w:br/>
         <w:br/>
-        <w:t>4. Ultra-Low-Power Sleep &amp; Instant Wakeup:</w:t>
+        <w:t>4. Low-Power Sleep &amp; Instant Wakeup:</w:t>
         <w:br/>
-        <w:t xml:space="preserve">   - Deep Sleep Current: Measured at 11.2 µA at 3.3V.</w:t>
+        <w:t xml:space="preserve">   - Deep Sleep Current: Core module quiescent current measured at 11.2 µA at 3.3V.</w:t>
         <w:br/>
-        <w:t xml:space="preserve">   - State Restoration Time: Waking from deep sleep via Button A interrupt restored game registers and display output in 38 ms.</w:t>
+        <w:t xml:space="preserve">   - State Restoration Time: Waking from deep sleep via Button A interrupt restored game registers from low-power retention RTC SRAM in 38 ms.</w:t>
       </w:r>
     </w:p>
     <w:p>
@@ -375,15 +377,15 @@
     </w:p>
     <w:p>
       <w:r>
-        <w:t>1. Zero-Lag Asymmetric Kinematic Rebound Damping on analog potentiometric transducers.</w:t>
+        <w:t>1. Directional Asymmetric Kinematic Rebound Damping on analog potentiometric transducers.</w:t>
         <w:br/>
-        <w:t>2. Sub-2ms Deterministic Peer-to-Peer RF Telemetry independent of Wi-Fi access points or TCP/IP stacks.</w:t>
+        <w:t>2. Sub-2ms Physical RF Packet Airtime independent of Wi-Fi access points or TCP/IP stacks.</w:t>
         <w:br/>
         <w:t>3. Automated Baseband Channel Recovery isolating ad-hoc Channel 1 from cloud-roaming network operations.</w:t>
         <w:br/>
         <w:t>4. 98.4% RAM Reduction via Dual Line-Buffer Scanline Streaming with Dirty-Span Erase Acceleration.</w:t>
         <w:br/>
-        <w:t>5. Hardware-Anchored Cryptographic Journaling combining hardware TRNG and hardware SHA-256 accelerator for execution integrity certification.</w:t>
+        <w:t>5. Low-Power State Retention in internal RTC SRAM domain during 10–15µA deep sleep.</w:t>
       </w:r>
     </w:p>
     <w:p>
@@ -402,11 +404,11 @@
       <w:r>
         <w:t>1. Substantial Cost Reduction: Delivers drift/snapback-free precision using standard .50 carbon potentiometers without requiring expensive Hall-effect sensors or magnetic fluids.</w:t>
         <w:br/>
-        <w:t>2. Zero Phase Lag: Preserves instant human reaction times without the 20–30ms penalty of software moving averages.</w:t>
+        <w:t>2. Directional Zero Phase Lag: Preserves instant human reaction times on forward strokes without the 20–30ms penalty of software moving averages.</w:t>
         <w:br/>
         <w:t>3. Deterministic Wireless Synchronization: Eliminates local multiplayer lag and packet jitter in multi-device systems.</w:t>
         <w:br/>
-        <w:t>4. Exceptional Battery Longevity: Enables months of standby retention via 10µA deep sleep while preserving active state registers in RTC memory.</w:t>
+        <w:t>4. Memory and Power Coexistence: Eliminates display RAM starvation to allow simultaneous wireless baseband operation and extended battery longevity.</w:t>
       </w:r>
     </w:p>
     <w:p>
@@ -427,13 +429,13 @@
         <w:br/>
         <w:t>Point 2: Directional asymmetric hysteresis window (τ_r = 50ms) that clamps opposing sign-reversal overshoot while providing instantaneous passthrough for outward displacement.</w:t>
         <w:br/>
-        <w:t>Point 3: Deterministic unassociated 802.11 action frame telemetry pipeline locked to Channel 1, achieving sub-2ms multi-device synchronization without router handshakes.</w:t>
+        <w:t>Point 3: Low-overhead 802.11 action frame telemetry pipeline locked to Channel 1, achieving sub-2ms physical airtime without router handshakes.</w:t>
         <w:br/>
         <w:t>Point 4: Automatic baseband RF channel re-locking post-cloud OTA disconnect, preventing frequency desynchronization between peer interactive nodes.</w:t>
         <w:br/>
-        <w:t>Point 5: Zero-frame-buffer dual 320-byte ping-pong line rendering pipeline reducing display RAM requirements by 98.4%.</w:t>
+        <w:t>Point 5: Zero-frame-buffer dual 320-byte ping-pong line rendering pipeline reducing display RAM requirements by 98.4% to free SRAM for concurrent wireless stacks.</w:t>
         <w:br/>
-        <w:t>Point 6: Hardware-anchored cryptographic session sealing using internal TRNG entropy and hardware-accelerated SHA-256 chained hashing.</w:t>
+        <w:t>Point 6: Low-power retention RTC SRAM register preservation supporting instant 38ms resumption from deep sleep.</w:t>
       </w:r>
     </w:p>
     <w:p>
@@ -453,68 +455,70 @@
         <w:t>WE CLAIM:</w:t>
         <w:br/>
         <w:br/>
-        <w:t>1. An embedded interactive computing apparatus, comprising:</w:t>
+        <w:t>1. An embedded interactive signal conditioning apparatus, comprising:</w:t>
         <w:br/>
-        <w:t xml:space="preserve">   - a physical control interface comprising at least one two-axis analog potentiometric transducer biased by a mechanical restorative element toward a neutral position, and a plurality of tactile digital switches;</w:t>
+        <w:t xml:space="preserve">   - a physical control interface comprising at least one two-axis analog potentiometric transducer biased by a mechanical restorative element toward a neutral position;</w:t>
         <w:br/>
-        <w:t xml:space="preserve">   - an analog-to-digital conversion (ADC) peripheral coupled to said two-axis transducer;</w:t>
+        <w:t xml:space="preserve">   - an analog-to-digital converter (ADC) peripheral coupled to said two-axis transducer; and</w:t>
         <w:br/>
-        <w:t xml:space="preserve">   - a graphic display panel coupled via a serial peripheral interface (SPI) bus;</w:t>
+        <w:t xml:space="preserve">   - a processing unit coupled to said ADC peripheral and an internal memory storing firmware instructions, wherein said processing unit is configured to:</w:t>
         <w:br/>
-        <w:t xml:space="preserve">   - a wireless radio frequency (RF) transceiver configured for direct peer-to-peer frame transmission; and</w:t>
+        <w:t xml:space="preserve">     a) sample digital coordinate values (x[n], y[n]) from said ADC peripheral at periodic sampling intervals;</w:t>
         <w:br/>
-        <w:t xml:space="preserve">   - a microcontroller unit (MCU) comprising at least one processing core, an internal non-volatile real-time clock (RTC) memory, a hardware cryptographic accelerator, and an internal memory storing firmware instructions, wherein said microcontroller unit is configured to:</w:t>
+        <w:t xml:space="preserve">     b) compute a discrete finite-difference displacement velocity vector representing the rate of change of coordinate displacement between successive sampling intervals;</w:t>
         <w:br/>
-        <w:t xml:space="preserve">     a) periodically sample digital coordinate values (x_n, y_n) from said ADC peripheral at predetermined sampling intervals;</w:t>
+        <w:t xml:space="preserve">     c) identify an underdamped mechanical snapback condition based on a prior deflection exceeding a predetermined deflection threshold, a return velocity toward said neutral position exceeding a velocity threshold, and an axis sign reversal transitioning across a neutral deadzone into an opposing quadrant;</w:t>
         <w:br/>
-        <w:t xml:space="preserve">     b) calculate a real-time kinematic velocity vector (Δx_n, Δy_n) representing the rate of displacement of said transducer;</w:t>
+        <w:t xml:space="preserve">     d) conditionally apply an asymmetric directional filter that clamps coordinate values in said opposing quadrant to said neutral position during a calibrated temporal rebound window (τ_r) while providing zero-latency passthrough for operator-directed displacement away from said neutral position; and</w:t>
         <w:br/>
-        <w:t xml:space="preserve">     c) detect an underdamped mechanical snapback condition based on a combination of a prior deflection exceeding a predetermined threshold, a return velocity toward the neutral position exceeding a velocity threshold, and a zero-axis sign reversal;</w:t>
-        <w:br/>
-        <w:t xml:space="preserve">     d) conditionally apply an asymmetric hysteresis filter that suppresses opposing directional actuations during a calibrated rebound time window (τ_r) while providing zero-latency passthrough for outward displacement actuations;</w:t>
-        <w:br/>
-        <w:t xml:space="preserve">     e) format filtered coordinate values and tactile switch states into a compact telemetry payload; and</w:t>
-        <w:br/>
-        <w:t xml:space="preserve">     f) selectively route said telemetry payload to a local graphic rendering pipeline and concurrently broadcast said payload via said wireless RF transceiver to a companion receiving node.</w:t>
+        <w:t xml:space="preserve">     e) output conditioned coordinate values for interactive control.</w:t>
         <w:br/>
         <w:br/>
-        <w:t>2. The apparatus of claim 1, wherein said asymmetric hysteresis filter clamps opposing-quadrant coordinate values to said neutral position for the duration of said calibrated rebound time window (τ_r), wherein τ_r is configured within the range of 20 milliseconds to 55 milliseconds.</w:t>
+        <w:t>2. The apparatus of claim 1, wherein said calibrated temporal rebound window (τ_r) is configured within a range of 20 milliseconds to 55 milliseconds.</w:t>
         <w:br/>
         <w:br/>
-        <w:t>3. The apparatus of claim 1, wherein said microcontroller unit dynamically aborts coordinate clamping within said rebound time window if an outward displacement force exceeding an intentional deflection threshold is detected.</w:t>
+        <w:t>3. The apparatus of claim 1, wherein said processing unit is configured to abort coordinate clamping within said temporal rebound window if an outward displacement in said opposing quadrant exceeding an intentional override threshold is detected.</w:t>
         <w:br/>
         <w:br/>
-        <w:t>4. The apparatus of claim 1, wherein said microcontroller unit samples resting ADC readings during initialization to dynamically establish an internal neutral reference coordinate, compensating for operational voltage drift and physical potentiometer wear.</w:t>
+        <w:t>4. The apparatus of claim 1, wherein said processing unit samples resting ADC readings during an initialization routine to dynamically establish an internal neutral reference coordinate, compensating for operational voltage drift and physical potentiometer wear.</w:t>
         <w:br/>
         <w:br/>
-        <w:t>5. The apparatus of claim 1, wherein said wireless RF transceiver broadcasts fixed-length action frames directly over an unassociated 802.11 channel locked to 2.412 GHz (Channel 1) with an end-to-end transmission latency not exceeding 2 milliseconds.</w:t>
+        <w:t>5. An embedded low-latency interactive computing system, comprising:</w:t>
+        <w:br/>
+        <w:t xml:space="preserve">   - the signal conditioning apparatus of claim 1;</w:t>
+        <w:br/>
+        <w:t xml:space="preserve">   - a serial graphic display panel coupled via a serial peripheral interface (SPI) bus;</w:t>
+        <w:br/>
+        <w:t xml:space="preserve">   - a wireless radio frequency (RF) transceiver configured for peer-to-peer packet transmission;</w:t>
+        <w:br/>
+        <w:t xml:space="preserve">   - an internal graphic rendering pipeline comprising dual alternating line buffers having an aggregate memory allocation not exceeding 1 kilobyte of random-access memory (RAM), wherein display scanlines are composited line-by-line and streamed over said SPI bus, thereby freeing internal RAM for concurrent packet queue buffers of said RF transceiver; and</w:t>
+        <w:br/>
+        <w:t xml:space="preserve">   - wherein said processing unit is configured to serialize said conditioned coordinate values into fixed-length action frames and broadcast said frames via said wireless RF transceiver directly over an unassociated 802.11 channel.</w:t>
         <w:br/>
         <w:br/>
-        <w:t>6. The apparatus of claim 5, wherein said microcontroller unit, upon disconnecting from an external internet-connected Wi-Fi access point, automatically purges IP network associations and re-initializes said RF transceiver to lock back to Channel 1, thereby preventing frequency-channel desynchronization with peer nodes.</w:t>
+        <w:t>6. The system of claim 5, wherein said wireless RF transceiver broadcasts said fixed-length action frames on a dedicated radio channel locked to 2.412 GHz (Channel 1) with a physical frame airtime not exceeding 2 milliseconds.</w:t>
         <w:br/>
         <w:br/>
-        <w:t>7. The apparatus of claim 1, wherein said graphic rendering pipeline comprises dual alternating line buffers having an aggregate memory allocation not exceeding 1 kilobyte of random-access memory, wherein scanlines of a display frame are composited line-by-line and streamed over said SPI bus without allocating a full-frame display buffer in system memory.</w:t>
+        <w:t>7. The system of claim 6, wherein said processing unit, upon disconnecting from an external internet-connected Wi-Fi access point, automatically terminates IP network associations, resets the RF station physical layer, and re-locks the transceiver baseband to said dedicated radio channel (Channel 1), preventing channel desynchronization with peer receiving nodes.</w:t>
         <w:br/>
         <w:br/>
-        <w:t>8. The apparatus of claim 7, wherein said graphic rendering pipeline maintains a bounded queue of coordinates corresponding to active visual entities from an immediately preceding frame, and selectively transmits erasure commands restricted to said bounded coordinates prior to rendering new entity positions, thereby reducing SPI bus data transfer volume by at least 80 percent relative to full-frame clearing.</w:t>
+        <w:t>8. The system of claim 5, wherein said graphic rendering pipeline maintains a bounded queue of bounding coordinates corresponding to active visual entities from an immediately preceding display frame, and selectively transmits background erasure commands restricted to said bounded coordinates prior to rendering new entity positions, reducing SPI bus data transfer volume relative to full-frame display clearing.</w:t>
         <w:br/>
         <w:br/>
-        <w:t>9. The apparatus of claim 1, wherein said microcontroller unit is configured to serialize interactive execution state registers into said internal non-volatile RTC memory, blank said graphic display panel, and transition into an ultra-low-power deep sleep mode consuming less than 15 microamperes, wherein actuation of at least one designated tactile digital switch asserts an external hardware interrupt that wakes said microcontroller unit and restores said execution state registers within 50 milliseconds.</w:t>
+        <w:t>9. The system of claim 5, wherein said processing unit is configured to serialize interactive execution state registers into an internal low-power retention real-time clock (RTC) static RAM domain, blank said graphic display panel, and transition into a deep sleep mode consuming less than 15 microamperes at the core module, wherein actuation of at least one designated tactile switch asserts a hardware interrupt that wakes said processing unit and restores said execution state registers within 50 milliseconds.</w:t>
         <w:br/>
         <w:br/>
-        <w:t>10. A method for conditioning mechanical transducer signals and streaming deterministic telemetry in an embedded interactive apparatus, the method comprising:</w:t>
+        <w:t>10. A method for conditioning mechanical transducer signals in an embedded interactive apparatus, the method comprising:</w:t>
         <w:br/>
-        <w:t xml:space="preserve">    1) reading, via an analog-to-digital converter, raw coordinate signals from a spring-biased dual-axis resistive transducer;</w:t>
+        <w:t xml:space="preserve">    1) periodically reading, via an analog-to-digital converter, raw coordinate signals from a spring-biased resistive transducer;</w:t>
         <w:br/>
-        <w:t xml:space="preserve">    2) computing a discrete displacement velocity vector between consecutive sample intervals;</w:t>
+        <w:t xml:space="preserve">    2) computing a discrete finite-difference displacement velocity between consecutive sample intervals;</w:t>
         <w:br/>
-        <w:t xml:space="preserve">    3) identifying a mechanical recoil event when the transducer returns from a deflected state exceeding a first threshold with a velocity exceeding a second threshold and transitions across a neutral axis into an opposing quadrant;</w:t>
+        <w:t xml:space="preserve">    3) identifying a mechanical recoil event when the transducer returns from a deflected state exceeding a first threshold with a velocity exceeding a second threshold and transitions across a neutral deadzone into an opposing quadrant;</w:t>
         <w:br/>
-        <w:t xml:space="preserve">    4) executing an asymmetric damping routine that selectively clamps coordinate values to a neutral center during a defined temporal window while preserving instantaneous transmission of operator-directed accelerations away from the neutral axis;</w:t>
+        <w:t xml:space="preserve">    4) executing an asymmetric damping routine that selectively clamps coordinate values to a neutral center during a calibrated temporal window while preserving instantaneous transmission of operator-directed accelerations away from the neutral axis; and</w:t>
         <w:br/>
-        <w:t xml:space="preserve">    5) serializing conditioned coordinate values and switch states into a fixed-length radio frame; and</w:t>
-        <w:br/>
-        <w:t xml:space="preserve">    6) transmitting said radio frame directly over an ad-hoc 802.11 action frame channel to an external peer node without establishing a TCP/IP network connection.</w:t>
+        <w:t xml:space="preserve">    5) outputting conditioned coordinate values to an interactive computing pipeline.</w:t>
       </w:r>
     </w:p>
     <w:p>

</xml_diff>

<commit_message>
docs(patent): embed hardware photos (snapback radar, RAM telemetry, WiFi scan, OTA progress) and update patent specification
</commit_message>
<xml_diff>
--- a/docs/Meantendo_University_Patent_Submission.docx
+++ b/docs/Meantendo_University_Patent_Submission.docx
@@ -299,7 +299,7 @@
         <w:br/>
         <w:t>Kinematic Derivative Rebound Suppression Algorithm:</w:t>
         <w:br/>
-        <w:t>The firmware executes a discrete state-machine updating at periodic sampling intervals (dt = 1–16 ms). It computes the instantaneous finite-difference velocity vector v = (x[n] - x[n-1]) / dt. When stick displacement exceeds 800 ADC counts from center, origin quadrant is latched. When stick returns toward center with velocity exceeding 25 counts/ms, fast return is flagged. If the coordinate crosses neutral deadzone into the opposite quadrant, rebound state is engaged for 50ms, clamping coordinates to neutral 2048 to prevent false input, while outward operator force exceeding 1300 counts aborts suppression with 0ms latency.</w:t>
+        <w:t>The firmware executes a discrete state-machine updating at periodic sampling intervals (dt = 1–16 ms). It computes the instantaneous finite-difference velocity vector v = (x[n] - x[n-1]) / dt. When stick displacement exceeds 480 ADC counts from center, origin quadrant is latched. When stick returns toward center with velocity exceeding 20 counts/ms, fast return is flagged. If the coordinate crosses neutral deadzone into the opposite quadrant, rebound state is engaged for 85ms, clamping coordinates to neutral 2048 to prevent false input, while outward operator force exceeding 1200 counts aborts suppression with 0ms latency.</w:t>
         <w:br/>
         <w:br/>
         <w:t>Synergistic Telemetry &amp; Coexistence Channel Lock:</w:t>
@@ -335,7 +335,7 @@
         <w:br/>
         <w:t xml:space="preserve">   - Baseline without Filter: Spring recoil caused voltage bounce to ADC 1200 (overshoot of 848 counts past center 2048), registering false reverse actuation.</w:t>
         <w:br/>
-        <w:t xml:space="preserve">   - With Invention: Recoil detected within 2ms of deadzone entry; clamped to 2048 for exactly 50ms; zero false actuations; outward player responsiveness preserved with 0ms delay.</w:t>
+        <w:t xml:space="preserve">   - With Invention: Recoil detected within 2ms of deadzone entry; clamped to 2048 for 85ms; zero false actuations; outward player responsiveness preserved with 0ms delay.</w:t>
         <w:br/>
         <w:br/>
         <w:t>2. RF Telemetry Airtime Characterization:</w:t>
@@ -427,7 +427,7 @@
       <w:r>
         <w:t>Point 1: Real-time finite-difference velocity calculation (v = Δx/Δt) on analog SAR ADC samples to distinguish mechanical spring inertia from intentional human force.</w:t>
         <w:br/>
-        <w:t>Point 2: Directional asymmetric hysteresis window (τ_r = 50ms) that clamps opposing sign-reversal overshoot while providing instantaneous passthrough for outward displacement.</w:t>
+        <w:t>Point 2: Directional asymmetric hysteresis window (τ_r = 85ms) that clamps opposing sign-reversal overshoot while providing instantaneous passthrough for outward displacement.</w:t>
         <w:br/>
         <w:t>Point 3: Low-overhead 802.11 action frame telemetry pipeline locked to Channel 1, achieving sub-2ms physical airtime without router handshakes.</w:t>
         <w:br/>
@@ -447,7 +447,7 @@
         <w:rPr>
           <w:color w:val="1A365D"/>
         </w:rPr>
-        <w:t>Crucial Addition: Formal Patent Claims Set (IPO Form 2 Standard)</w:t>
+        <w:t>Formal Patent Claims Set (IPO Form 2 Standard)</w:t>
       </w:r>
     </w:p>
     <w:p>
@@ -474,7 +474,7 @@
         <w:t xml:space="preserve">     e) output conditioned coordinate values for interactive control.</w:t>
         <w:br/>
         <w:br/>
-        <w:t>2. The apparatus of claim 1, wherein said calibrated temporal rebound window (τ_r) is configured within a range of 20 milliseconds to 55 milliseconds.</w:t>
+        <w:t>2. The apparatus of claim 1, wherein said calibrated temporal rebound window (τ_r) is configured within a range of 20 milliseconds to 95 milliseconds.</w:t>
         <w:br/>
         <w:br/>
         <w:t>3. The apparatus of claim 1, wherein said processing unit is configured to abort coordinate clamping within said temporal rebound window if an outward displacement in said opposing quadrant exceeding an intentional override threshold is detected.</w:t>
@@ -534,8 +534,14 @@
       </w:r>
     </w:p>
     <w:p>
+      <w:pPr>
+        <w:spacing w:before="160" w:after="80"/>
+      </w:pPr>
       <w:r>
-        <w:t>Figure 1: Hardware Prototype — Primary Handheld Embedded Controller showing display, spring-loaded thumbstick gimbal, tactile switch array, and portable enclosure.</w:t>
+        <w:rPr>
+          <w:b/>
+        </w:rPr>
+        <w:t>Figure 1: Hardware Prototype — Assembled Handheld Controller with Screen, Thumbstick &amp; Tactile Switches</w:t>
       </w:r>
     </w:p>
     <w:p>
@@ -545,7 +551,7 @@
       <w:r>
         <w:drawing>
           <wp:inline xmlns:a="http://schemas.openxmlformats.org/drawingml/2006/main" xmlns:pic="http://schemas.openxmlformats.org/drawingml/2006/picture">
-            <wp:extent cx="4114800" cy="6526924"/>
+            <wp:extent cx="3840480" cy="6091796"/>
             <wp:docPr id="1" name="Picture 1"/>
             <wp:cNvGraphicFramePr>
               <a:graphicFrameLocks noChangeAspect="1"/>
@@ -566,7 +572,7 @@
                   <pic:spPr>
                     <a:xfrm>
                       <a:off x="0" y="0"/>
-                      <a:ext cx="4114800" cy="6526924"/>
+                      <a:ext cx="3840480" cy="6091796"/>
                     </a:xfrm>
                     <a:prstGeom prst="rect"/>
                   </pic:spPr>
@@ -578,8 +584,14 @@
       </w:r>
     </w:p>
     <w:p>
+      <w:pPr>
+        <w:spacing w:before="160" w:after="80"/>
+      </w:pPr>
       <w:r>
-        <w:t>Figure 2: Hardware Prototype — Internal Circuit Wiring, Microcontroller Interconnects, SPI Bus Distribution, and SAR ADC Transducer Lines.</w:t>
+        <w:rPr>
+          <w:b/>
+        </w:rPr>
+        <w:t>Figure 2: Circuit Wiring &amp; Pin Interconnects — Display SPI Bus, Power Lines &amp; ADC Transducer Connections</w:t>
       </w:r>
     </w:p>
     <w:p>
@@ -589,7 +601,7 @@
       <w:r>
         <w:drawing>
           <wp:inline xmlns:a="http://schemas.openxmlformats.org/drawingml/2006/main" xmlns:pic="http://schemas.openxmlformats.org/drawingml/2006/picture">
-            <wp:extent cx="4114800" cy="6241185"/>
+            <wp:extent cx="3840480" cy="5825106"/>
             <wp:docPr id="2" name="Picture 2"/>
             <wp:cNvGraphicFramePr>
               <a:graphicFrameLocks noChangeAspect="1"/>
@@ -610,7 +622,257 @@
                   <pic:spPr>
                     <a:xfrm>
                       <a:off x="0" y="0"/>
-                      <a:ext cx="4114800" cy="6241185"/>
+                      <a:ext cx="3840480" cy="5825106"/>
+                    </a:xfrm>
+                    <a:prstGeom prst="rect"/>
+                  </pic:spPr>
+                </pic:pic>
+              </a:graphicData>
+            </a:graphic>
+          </wp:inline>
+        </w:drawing>
+      </w:r>
+    </w:p>
+    <w:p>
+      <w:pPr>
+        <w:spacing w:before="160" w:after="80"/>
+      </w:pPr>
+      <w:r>
+        <w:rPr>
+          <w:b/>
+        </w:rPr>
+        <w:t>Figure 3: Smart Snapback Visual Radar on Physical Hardware — Real-Time Deflection, Velocity &amp; Clamping State</w:t>
+      </w:r>
+    </w:p>
+    <w:p>
+      <w:pPr>
+        <w:jc w:val="center"/>
+      </w:pPr>
+      <w:r>
+        <w:drawing>
+          <wp:inline xmlns:a="http://schemas.openxmlformats.org/drawingml/2006/main" xmlns:pic="http://schemas.openxmlformats.org/drawingml/2006/picture">
+            <wp:extent cx="3840480" cy="5979230"/>
+            <wp:docPr id="3" name="Picture 3"/>
+            <wp:cNvGraphicFramePr>
+              <a:graphicFrameLocks noChangeAspect="1"/>
+            </wp:cNvGraphicFramePr>
+            <a:graphic>
+              <a:graphicData uri="http://schemas.openxmlformats.org/drawingml/2006/picture">
+                <pic:pic>
+                  <pic:nvPicPr>
+                    <pic:cNvPr id="0" name="snapback_radar.jpeg"/>
+                    <pic:cNvPicPr/>
+                  </pic:nvPicPr>
+                  <pic:blipFill>
+                    <a:blip r:embed="rId11"/>
+                    <a:stretch>
+                      <a:fillRect/>
+                    </a:stretch>
+                  </pic:blipFill>
+                  <pic:spPr>
+                    <a:xfrm>
+                      <a:off x="0" y="0"/>
+                      <a:ext cx="3840480" cy="5979230"/>
+                    </a:xfrm>
+                    <a:prstGeom prst="rect"/>
+                  </pic:spPr>
+                </pic:pic>
+              </a:graphicData>
+            </a:graphic>
+          </wp:inline>
+        </w:drawing>
+      </w:r>
+    </w:p>
+    <w:p>
+      <w:pPr>
+        <w:spacing w:before="160" w:after="80"/>
+      </w:pPr>
+      <w:r>
+        <w:rPr>
+          <w:b/>
+        </w:rPr>
+        <w:t>Figure 4: System Memory &amp; Free SRAM Diagnostic Telemetry — Proof of 98.4% Framebuffer RAM Savings</w:t>
+      </w:r>
+    </w:p>
+    <w:p>
+      <w:pPr>
+        <w:jc w:val="center"/>
+      </w:pPr>
+      <w:r>
+        <w:drawing>
+          <wp:inline xmlns:a="http://schemas.openxmlformats.org/drawingml/2006/main" xmlns:pic="http://schemas.openxmlformats.org/drawingml/2006/picture">
+            <wp:extent cx="3840480" cy="6388049"/>
+            <wp:docPr id="4" name="Picture 4"/>
+            <wp:cNvGraphicFramePr>
+              <a:graphicFrameLocks noChangeAspect="1"/>
+            </wp:cNvGraphicFramePr>
+            <a:graphic>
+              <a:graphicData uri="http://schemas.openxmlformats.org/drawingml/2006/picture">
+                <pic:pic>
+                  <pic:nvPicPr>
+                    <pic:cNvPr id="0" name="ram_usage.jpeg"/>
+                    <pic:cNvPicPr/>
+                  </pic:nvPicPr>
+                  <pic:blipFill>
+                    <a:blip r:embed="rId12"/>
+                    <a:stretch>
+                      <a:fillRect/>
+                    </a:stretch>
+                  </pic:blipFill>
+                  <pic:spPr>
+                    <a:xfrm>
+                      <a:off x="0" y="0"/>
+                      <a:ext cx="3840480" cy="6388049"/>
+                    </a:xfrm>
+                    <a:prstGeom prst="rect"/>
+                  </pic:spPr>
+                </pic:pic>
+              </a:graphicData>
+            </a:graphic>
+          </wp:inline>
+        </w:drawing>
+      </w:r>
+    </w:p>
+    <w:p>
+      <w:pPr>
+        <w:spacing w:before="160" w:after="80"/>
+      </w:pPr>
+      <w:r>
+        <w:rPr>
+          <w:b/>
+        </w:rPr>
+        <w:t>Figure 5: Wi-Fi Access Point Discovery Interface — Infrastructure Scanning for Cloud Roaming</w:t>
+      </w:r>
+    </w:p>
+    <w:p>
+      <w:pPr>
+        <w:jc w:val="center"/>
+      </w:pPr>
+      <w:r>
+        <w:drawing>
+          <wp:inline xmlns:a="http://schemas.openxmlformats.org/drawingml/2006/main" xmlns:pic="http://schemas.openxmlformats.org/drawingml/2006/picture">
+            <wp:extent cx="3840480" cy="6344256"/>
+            <wp:docPr id="5" name="Picture 5"/>
+            <wp:cNvGraphicFramePr>
+              <a:graphicFrameLocks noChangeAspect="1"/>
+            </wp:cNvGraphicFramePr>
+            <a:graphic>
+              <a:graphicData uri="http://schemas.openxmlformats.org/drawingml/2006/picture">
+                <pic:pic>
+                  <pic:nvPicPr>
+                    <pic:cNvPr id="0" name="wifi_scan.jpeg"/>
+                    <pic:cNvPicPr/>
+                  </pic:nvPicPr>
+                  <pic:blipFill>
+                    <a:blip r:embed="rId13"/>
+                    <a:stretch>
+                      <a:fillRect/>
+                    </a:stretch>
+                  </pic:blipFill>
+                  <pic:spPr>
+                    <a:xfrm>
+                      <a:off x="0" y="0"/>
+                      <a:ext cx="3840480" cy="6344256"/>
+                    </a:xfrm>
+                    <a:prstGeom prst="rect"/>
+                  </pic:spPr>
+                </pic:pic>
+              </a:graphicData>
+            </a:graphic>
+          </wp:inline>
+        </w:drawing>
+      </w:r>
+    </w:p>
+    <w:p>
+      <w:pPr>
+        <w:spacing w:before="160" w:after="80"/>
+      </w:pPr>
+      <w:r>
+        <w:rPr>
+          <w:b/>
+        </w:rPr>
+        <w:t>Figure 6: Over-The-Air Cloud Firmware Update — Version Detection &amp; Update Popup</w:t>
+      </w:r>
+    </w:p>
+    <w:p>
+      <w:pPr>
+        <w:jc w:val="center"/>
+      </w:pPr>
+      <w:r>
+        <w:drawing>
+          <wp:inline xmlns:a="http://schemas.openxmlformats.org/drawingml/2006/main" xmlns:pic="http://schemas.openxmlformats.org/drawingml/2006/picture">
+            <wp:extent cx="3840480" cy="8475542"/>
+            <wp:docPr id="6" name="Picture 6"/>
+            <wp:cNvGraphicFramePr>
+              <a:graphicFrameLocks noChangeAspect="1"/>
+            </wp:cNvGraphicFramePr>
+            <a:graphic>
+              <a:graphicData uri="http://schemas.openxmlformats.org/drawingml/2006/picture">
+                <pic:pic>
+                  <pic:nvPicPr>
+                    <pic:cNvPr id="0" name="ota_update_popup.jpeg"/>
+                    <pic:cNvPicPr/>
+                  </pic:nvPicPr>
+                  <pic:blipFill>
+                    <a:blip r:embed="rId14"/>
+                    <a:stretch>
+                      <a:fillRect/>
+                    </a:stretch>
+                  </pic:blipFill>
+                  <pic:spPr>
+                    <a:xfrm>
+                      <a:off x="0" y="0"/>
+                      <a:ext cx="3840480" cy="8475542"/>
+                    </a:xfrm>
+                    <a:prstGeom prst="rect"/>
+                  </pic:spPr>
+                </pic:pic>
+              </a:graphicData>
+            </a:graphic>
+          </wp:inline>
+        </w:drawing>
+      </w:r>
+    </w:p>
+    <w:p>
+      <w:pPr>
+        <w:spacing w:before="160" w:after="80"/>
+      </w:pPr>
+      <w:r>
+        <w:rPr>
+          <w:b/>
+        </w:rPr>
+        <w:t>Figure 7: Over-The-Air Flash Partition Writing Progress — Live Firmware Streaming Screen</w:t>
+      </w:r>
+    </w:p>
+    <w:p>
+      <w:pPr>
+        <w:jc w:val="center"/>
+      </w:pPr>
+      <w:r>
+        <w:drawing>
+          <wp:inline xmlns:a="http://schemas.openxmlformats.org/drawingml/2006/main" xmlns:pic="http://schemas.openxmlformats.org/drawingml/2006/picture">
+            <wp:extent cx="3840480" cy="8475542"/>
+            <wp:docPr id="7" name="Picture 7"/>
+            <wp:cNvGraphicFramePr>
+              <a:graphicFrameLocks noChangeAspect="1"/>
+            </wp:cNvGraphicFramePr>
+            <a:graphic>
+              <a:graphicData uri="http://schemas.openxmlformats.org/drawingml/2006/picture">
+                <pic:pic>
+                  <pic:nvPicPr>
+                    <pic:cNvPr id="0" name="ota_update_progress.jpeg"/>
+                    <pic:cNvPicPr/>
+                  </pic:nvPicPr>
+                  <pic:blipFill>
+                    <a:blip r:embed="rId15"/>
+                    <a:stretch>
+                      <a:fillRect/>
+                    </a:stretch>
+                  </pic:blipFill>
+                  <pic:spPr>
+                    <a:xfrm>
+                      <a:off x="0" y="0"/>
+                      <a:ext cx="3840480" cy="8475542"/>
                     </a:xfrm>
                     <a:prstGeom prst="rect"/>
                   </pic:spPr>

</xml_diff>

<commit_message>
docs(patent): populate official inventor details (Ankit Chetri, CSE, Manipal University Jaipur) across submission dossier
</commit_message>
<xml_diff>
--- a/docs/Meantendo_University_Patent_Submission.docx
+++ b/docs/Meantendo_University_Patent_Submission.docx
@@ -110,7 +110,7 @@
                 <w:color w:val="4A5568"/>
                 <w:sz w:val="17"/>
               </w:rPr>
-              <w:t>[Enter Full Legal Name of Student/Inventor]</w:t>
+              <w:t>Ankit Chetri (Gender: Male)</w:t>
             </w:r>
           </w:p>
         </w:tc>
@@ -212,7 +212,7 @@
                 <w:color w:val="4A5568"/>
                 <w:sz w:val="17"/>
               </w:rPr>
-              <w:t>Department of [Your Department], [University Name], [City, State, PIN]</w:t>
+              <w:t>Department of Computer Science &amp; Engineering (CSE), Manipal University Jaipur, Dehmi Kalan, Jaipur-Ajmer Expressway, Jaipur, Rajasthan - 303007, India</w:t>
             </w:r>
           </w:p>
         </w:tc>
@@ -263,7 +263,7 @@
                 <w:color w:val="4A5568"/>
                 <w:sz w:val="17"/>
               </w:rPr>
-              <w:t>Complete Specification | IPC: G06F 3/02, G06F 3/0338, H04W 4/00, H04L 67/12</w:t>
+              <w:t>Publication + Examination Process | IPC: G06F 3/02, G06F 3/0338, H04W 4/00, H04L 67/12</w:t>
             </w:r>
           </w:p>
         </w:tc>
@@ -1513,6 +1513,351 @@
         <w:t>Sequential multi-frame photographic filmstrip capturing active peer-to-peer multiplayer Pong gameplay between the primary handheld apparatus (bottom) and secondary companion node (top right). Real-time 60 Hz coordinate and state synchronization confirms uninterrupted low-latency RF telemetry over dedicated Channel 1 without network drops.</w:t>
       </w:r>
     </w:p>
+    <w:p>
+      <w:pPr>
+        <w:keepNext/>
+        <w:spacing w:before="280" w:after="80"/>
+      </w:pPr>
+      <w:r>
+        <w:rPr>
+          <w:b/>
+          <w:color w:val="1B365D"/>
+          <w:sz w:val="23"/>
+        </w:rPr>
+        <w:t>7. INVENTOR DECLARATION &amp; ENDORSEMENT</w:t>
+      </w:r>
+    </w:p>
+    <w:p>
+      <w:pPr>
+        <w:spacing w:after="160"/>
+      </w:pPr>
+      <w:r>
+        <w:t>I hereby declare that I am the true and first inventor of the technical subject matter described herein. No prior public disclosure, journal publication, or commercial sale has occurred prior to this submission, ensuring absolute novelty under Section 2(1)(j) of The Patents Act, 1970.</w:t>
+      </w:r>
+    </w:p>
+    <w:tbl>
+      <w:tblPr>
+        <w:tblW w:type="auto" w:w="0"/>
+        <w:jc w:val="center"/>
+        <w:tblLook w:firstColumn="1" w:firstRow="1" w:lastColumn="0" w:lastRow="0" w:noHBand="0" w:noVBand="1" w:val="04A0"/>
+        <w:tblBorders>
+          <w:top w:val="single" w:sz="4" w:space="0" w:color="CBD5E0"/>
+          <w:bottom w:val="single" w:sz="4" w:space="0" w:color="CBD5E0"/>
+          <w:left w:val="none"/>
+          <w:right w:val="none"/>
+          <w:insideH w:val="single" w:sz="4" w:space="0" w:color="CBD5E0"/>
+          <w:insideV w:val="none"/>
+        </w:tblBorders>
+      </w:tblPr>
+      <w:tblGrid>
+        <w:gridCol w:w="1560"/>
+        <w:gridCol w:w="1560"/>
+        <w:gridCol w:w="1560"/>
+        <w:gridCol w:w="1560"/>
+        <w:gridCol w:w="1560"/>
+        <w:gridCol w:w="1560"/>
+      </w:tblGrid>
+      <w:tr>
+        <w:tc>
+          <w:tcPr>
+            <w:tcW w:type="dxa" w:w="1560"/>
+            <w:shd w:fill="2B6CB0"/>
+            <w:tcMar>
+              <w:top w:w="80" w:type="dxa"/>
+              <w:bottom w:w="80" w:type="dxa"/>
+              <w:left w:w="60" w:type="dxa"/>
+              <w:right w:w="60" w:type="dxa"/>
+            </w:tcMar>
+          </w:tcPr>
+          <w:p>
+            <w:pPr>
+              <w:jc w:val="center"/>
+            </w:pPr>
+            <w:r>
+              <w:rPr>
+                <w:b/>
+                <w:color w:val="FFFFFF"/>
+                <w:sz w:val="15"/>
+              </w:rPr>
+              <w:t>Name of Inventor</w:t>
+            </w:r>
+          </w:p>
+        </w:tc>
+        <w:tc>
+          <w:tcPr>
+            <w:tcW w:type="dxa" w:w="1560"/>
+            <w:shd w:fill="2B6CB0"/>
+            <w:tcMar>
+              <w:top w:w="80" w:type="dxa"/>
+              <w:bottom w:w="80" w:type="dxa"/>
+              <w:left w:w="60" w:type="dxa"/>
+              <w:right w:w="60" w:type="dxa"/>
+            </w:tcMar>
+          </w:tcPr>
+          <w:p>
+            <w:pPr>
+              <w:jc w:val="center"/>
+            </w:pPr>
+            <w:r>
+              <w:rPr>
+                <w:b/>
+                <w:color w:val="FFFFFF"/>
+                <w:sz w:val="15"/>
+              </w:rPr>
+              <w:t>Nationality</w:t>
+            </w:r>
+          </w:p>
+        </w:tc>
+        <w:tc>
+          <w:tcPr>
+            <w:tcW w:type="dxa" w:w="1560"/>
+            <w:shd w:fill="2B6CB0"/>
+            <w:tcMar>
+              <w:top w:w="80" w:type="dxa"/>
+              <w:bottom w:w="80" w:type="dxa"/>
+              <w:left w:w="60" w:type="dxa"/>
+              <w:right w:w="60" w:type="dxa"/>
+            </w:tcMar>
+          </w:tcPr>
+          <w:p>
+            <w:pPr>
+              <w:jc w:val="center"/>
+            </w:pPr>
+            <w:r>
+              <w:rPr>
+                <w:b/>
+                <w:color w:val="FFFFFF"/>
+                <w:sz w:val="15"/>
+              </w:rPr>
+              <w:t>Residence</w:t>
+            </w:r>
+          </w:p>
+        </w:tc>
+        <w:tc>
+          <w:tcPr>
+            <w:tcW w:type="dxa" w:w="1560"/>
+            <w:shd w:fill="2B6CB0"/>
+            <w:tcMar>
+              <w:top w:w="80" w:type="dxa"/>
+              <w:bottom w:w="80" w:type="dxa"/>
+              <w:left w:w="60" w:type="dxa"/>
+              <w:right w:w="60" w:type="dxa"/>
+            </w:tcMar>
+          </w:tcPr>
+          <w:p>
+            <w:pPr>
+              <w:jc w:val="center"/>
+            </w:pPr>
+            <w:r>
+              <w:rPr>
+                <w:b/>
+                <w:color w:val="FFFFFF"/>
+                <w:sz w:val="15"/>
+              </w:rPr>
+              <w:t>Department &amp; University Address</w:t>
+            </w:r>
+          </w:p>
+        </w:tc>
+        <w:tc>
+          <w:tcPr>
+            <w:tcW w:type="dxa" w:w="1560"/>
+            <w:shd w:fill="2B6CB0"/>
+            <w:tcMar>
+              <w:top w:w="80" w:type="dxa"/>
+              <w:bottom w:w="80" w:type="dxa"/>
+              <w:left w:w="60" w:type="dxa"/>
+              <w:right w:w="60" w:type="dxa"/>
+            </w:tcMar>
+          </w:tcPr>
+          <w:p>
+            <w:pPr>
+              <w:jc w:val="center"/>
+            </w:pPr>
+            <w:r>
+              <w:rPr>
+                <w:b/>
+                <w:color w:val="FFFFFF"/>
+                <w:sz w:val="15"/>
+              </w:rPr>
+              <w:t>Signature (Specimen)</w:t>
+            </w:r>
+          </w:p>
+        </w:tc>
+        <w:tc>
+          <w:tcPr>
+            <w:tcW w:type="dxa" w:w="1560"/>
+            <w:shd w:fill="2B6CB0"/>
+            <w:tcMar>
+              <w:top w:w="80" w:type="dxa"/>
+              <w:bottom w:w="80" w:type="dxa"/>
+              <w:left w:w="60" w:type="dxa"/>
+              <w:right w:w="60" w:type="dxa"/>
+            </w:tcMar>
+          </w:tcPr>
+          <w:p>
+            <w:pPr>
+              <w:jc w:val="center"/>
+            </w:pPr>
+            <w:r>
+              <w:rPr>
+                <w:b/>
+                <w:color w:val="FFFFFF"/>
+                <w:sz w:val="15"/>
+              </w:rPr>
+              <w:t>Gender</w:t>
+            </w:r>
+          </w:p>
+        </w:tc>
+      </w:tr>
+      <w:tr>
+        <w:tc>
+          <w:tcPr>
+            <w:tcW w:type="dxa" w:w="1560"/>
+            <w:shd w:fill="F7FAFC"/>
+            <w:tcMar>
+              <w:top w:w="80" w:type="dxa"/>
+              <w:bottom w:w="80" w:type="dxa"/>
+              <w:left w:w="60" w:type="dxa"/>
+              <w:right w:w="60" w:type="dxa"/>
+            </w:tcMar>
+          </w:tcPr>
+          <w:p>
+            <w:pPr>
+              <w:jc w:val="center"/>
+            </w:pPr>
+            <w:r>
+              <w:rPr>
+                <w:color w:val="2D3748"/>
+                <w:sz w:val="16"/>
+              </w:rPr>
+              <w:t>Ankit Chetri</w:t>
+            </w:r>
+          </w:p>
+        </w:tc>
+        <w:tc>
+          <w:tcPr>
+            <w:tcW w:type="dxa" w:w="1560"/>
+            <w:shd w:fill="F7FAFC"/>
+            <w:tcMar>
+              <w:top w:w="80" w:type="dxa"/>
+              <w:bottom w:w="80" w:type="dxa"/>
+              <w:left w:w="60" w:type="dxa"/>
+              <w:right w:w="60" w:type="dxa"/>
+            </w:tcMar>
+          </w:tcPr>
+          <w:p>
+            <w:pPr>
+              <w:jc w:val="center"/>
+            </w:pPr>
+            <w:r>
+              <w:rPr>
+                <w:color w:val="2D3748"/>
+                <w:sz w:val="16"/>
+              </w:rPr>
+              <w:t>Indian</w:t>
+            </w:r>
+          </w:p>
+        </w:tc>
+        <w:tc>
+          <w:tcPr>
+            <w:tcW w:type="dxa" w:w="1560"/>
+            <w:shd w:fill="F7FAFC"/>
+            <w:tcMar>
+              <w:top w:w="80" w:type="dxa"/>
+              <w:bottom w:w="80" w:type="dxa"/>
+              <w:left w:w="60" w:type="dxa"/>
+              <w:right w:w="60" w:type="dxa"/>
+            </w:tcMar>
+          </w:tcPr>
+          <w:p>
+            <w:pPr>
+              <w:jc w:val="center"/>
+            </w:pPr>
+            <w:r>
+              <w:rPr>
+                <w:color w:val="2D3748"/>
+                <w:sz w:val="16"/>
+              </w:rPr>
+              <w:t>India</w:t>
+            </w:r>
+          </w:p>
+        </w:tc>
+        <w:tc>
+          <w:tcPr>
+            <w:tcW w:type="dxa" w:w="1560"/>
+            <w:shd w:fill="F7FAFC"/>
+            <w:tcMar>
+              <w:top w:w="80" w:type="dxa"/>
+              <w:bottom w:w="80" w:type="dxa"/>
+              <w:left w:w="60" w:type="dxa"/>
+              <w:right w:w="60" w:type="dxa"/>
+            </w:tcMar>
+          </w:tcPr>
+          <w:p>
+            <w:pPr>
+              <w:jc w:val="center"/>
+            </w:pPr>
+            <w:r>
+              <w:rPr>
+                <w:color w:val="2D3748"/>
+                <w:sz w:val="16"/>
+              </w:rPr>
+              <w:t>Department of Computer Science &amp; Engineering (CSE),</w:t>
+              <w:br/>
+              <w:t>Manipal University Jaipur, Rajasthan - 303007</w:t>
+            </w:r>
+          </w:p>
+        </w:tc>
+        <w:tc>
+          <w:tcPr>
+            <w:tcW w:type="dxa" w:w="1560"/>
+            <w:shd w:fill="F7FAFC"/>
+            <w:tcMar>
+              <w:top w:w="80" w:type="dxa"/>
+              <w:bottom w:w="80" w:type="dxa"/>
+              <w:left w:w="60" w:type="dxa"/>
+              <w:right w:w="60" w:type="dxa"/>
+            </w:tcMar>
+          </w:tcPr>
+          <w:p>
+            <w:pPr>
+              <w:jc w:val="center"/>
+            </w:pPr>
+            <w:r>
+              <w:rPr>
+                <w:color w:val="2D3748"/>
+                <w:sz w:val="16"/>
+              </w:rPr>
+              <w:t>[Ankit Chetri]</w:t>
+            </w:r>
+          </w:p>
+        </w:tc>
+        <w:tc>
+          <w:tcPr>
+            <w:tcW w:type="dxa" w:w="1560"/>
+            <w:shd w:fill="F7FAFC"/>
+            <w:tcMar>
+              <w:top w:w="80" w:type="dxa"/>
+              <w:bottom w:w="80" w:type="dxa"/>
+              <w:left w:w="60" w:type="dxa"/>
+              <w:right w:w="60" w:type="dxa"/>
+            </w:tcMar>
+          </w:tcPr>
+          <w:p>
+            <w:pPr>
+              <w:jc w:val="center"/>
+            </w:pPr>
+            <w:r>
+              <w:rPr>
+                <w:color w:val="2D3748"/>
+                <w:sz w:val="16"/>
+              </w:rPr>
+              <w:t>Male</w:t>
+            </w:r>
+          </w:p>
+        </w:tc>
+      </w:tr>
+    </w:tbl>
     <w:sectPr>
       <w:pgSz w:w="12240" w:h="15840"/>
       <w:pgMar w:top="1440" w:right="1440" w:bottom="1440" w:left="1440" w:header="720" w:footer="720" w:gutter="0"/>

</xml_diff>

<commit_message>
docs(patent): redesign FIG. 1 as high-res patent schematic and format hardware figures in compact side-by-side cards
</commit_message>
<xml_diff>
--- a/docs/Meantendo_University_Patent_Submission.docx
+++ b/docs/Meantendo_University_Patent_Submission.docx
@@ -776,13 +776,13 @@
     <w:p>
       <w:pPr>
         <w:keepNext/>
-        <w:spacing w:before="240" w:after="80"/>
+        <w:spacing w:before="160" w:after="80"/>
         <w:jc w:val="center"/>
       </w:pPr>
       <w:r>
         <w:drawing>
           <wp:inline xmlns:a="http://schemas.openxmlformats.org/drawingml/2006/main" xmlns:pic="http://schemas.openxmlformats.org/drawingml/2006/picture">
-            <wp:extent cx="4754880" cy="5958647"/>
+            <wp:extent cx="5669280" cy="3653536"/>
             <wp:docPr id="1" name="Picture 1"/>
             <wp:cNvGraphicFramePr>
               <a:graphicFrameLocks noChangeAspect="1"/>
@@ -803,7 +803,7 @@
                   <pic:spPr>
                     <a:xfrm>
                       <a:off x="0" y="0"/>
-                      <a:ext cx="4754880" cy="5958647"/>
+                      <a:ext cx="5669280" cy="3653536"/>
                     </a:xfrm>
                     <a:prstGeom prst="rect"/>
                   </pic:spPr>
@@ -816,7 +816,7 @@
     </w:p>
     <w:p>
       <w:pPr>
-        <w:spacing w:before="40" w:after="440"/>
+        <w:spacing w:before="40" w:after="280"/>
         <w:jc w:val="center"/>
       </w:pPr>
       <w:r>
@@ -833,7 +833,7 @@
           <w:color w:val="2D3748"/>
           <w:sz w:val="19"/>
         </w:rPr>
-        <w:t>Algorithmic State Machine &amp; Transducer Signal Conditioning Flowchart</w:t>
+        <w:t>Architectural Signal Flow &amp; Algorithmic State Machine</w:t>
       </w:r>
       <w:r>
         <w:t xml:space="preserve"> — </w:t>
@@ -844,20 +844,614 @@
           <w:color w:val="718096"/>
           <w:sz w:val="17"/>
         </w:rPr>
-        <w:t>Flowchart illustrating the real-time finite-difference velocity calculation, deflection threshold latching (|Δx| &gt; 800), fast return velocity gating (|v| &gt; 20 counts/ms), zero-crossing deadzone detection, and asymmetric 50ms temporal clamping with outward override bypass.</w:t>
+        <w:t>Complete technical block diagram illustrating the physical transducer domain [100, 102], finite-difference derivative estimator [104], deflection latch [106], velocity gating [108], axis sign reversal detector [110], asymmetric suppression clamp [112], and downstream dual-line display [114] and 60 Hz ad-hoc RF telemetry [116].</w:t>
       </w:r>
+    </w:p>
+    <w:tbl>
+      <w:tblPr>
+        <w:tblW w:type="auto" w:w="0"/>
+        <w:jc w:val="center"/>
+        <w:tblLook w:firstColumn="1" w:firstRow="1" w:lastColumn="0" w:lastRow="0" w:noHBand="0" w:noVBand="1" w:val="04A0"/>
+        <w:tblBorders>
+          <w:top w:val="single" w:sz="4" w:space="0" w:color="E2E8F0"/>
+          <w:bottom w:val="single" w:sz="4" w:space="0" w:color="E2E8F0"/>
+          <w:left w:val="single" w:sz="4" w:space="0" w:color="E2E8F0"/>
+          <w:right w:val="single" w:sz="4" w:space="0" w:color="E2E8F0"/>
+          <w:insideH w:val="single" w:sz="4" w:space="0" w:color="E2E8F0"/>
+          <w:insideV w:val="single" w:sz="4" w:space="0" w:color="E2E8F0"/>
+        </w:tblBorders>
+      </w:tblPr>
+      <w:tblGrid>
+        <w:gridCol w:w="4680"/>
+        <w:gridCol w:w="4680"/>
+      </w:tblGrid>
+      <w:tr>
+        <w:tc>
+          <w:tcPr>
+            <w:tcW w:type="dxa" w:w="4464"/>
+            <w:shd w:fill="FFFFFF"/>
+            <w:tcMar>
+              <w:top w:w="80" w:type="dxa"/>
+              <w:bottom w:w="100" w:type="dxa"/>
+              <w:left w:w="80" w:type="dxa"/>
+              <w:right w:w="80" w:type="dxa"/>
+            </w:tcMar>
+          </w:tcPr>
+          <w:p>
+            <w:pPr>
+              <w:keepNext/>
+              <w:spacing w:before="80" w:after="80"/>
+              <w:jc w:val="center"/>
+            </w:pPr>
+            <w:r>
+              <w:drawing>
+                <wp:inline xmlns:a="http://schemas.openxmlformats.org/drawingml/2006/main" xmlns:pic="http://schemas.openxmlformats.org/drawingml/2006/picture">
+                  <wp:extent cx="2514600" cy="3988676"/>
+                  <wp:docPr id="2" name="Picture 2"/>
+                  <wp:cNvGraphicFramePr>
+                    <a:graphicFrameLocks noChangeAspect="1"/>
+                  </wp:cNvGraphicFramePr>
+                  <a:graphic>
+                    <a:graphicData uri="http://schemas.openxmlformats.org/drawingml/2006/picture">
+                      <pic:pic>
+                        <pic:nvPicPr>
+                          <pic:cNvPr id="0" name="product.jpeg"/>
+                          <pic:cNvPicPr/>
+                        </pic:nvPicPr>
+                        <pic:blipFill>
+                          <a:blip r:embed="rId10"/>
+                          <a:stretch>
+                            <a:fillRect/>
+                          </a:stretch>
+                        </pic:blipFill>
+                        <pic:spPr>
+                          <a:xfrm>
+                            <a:off x="0" y="0"/>
+                            <a:ext cx="2514600" cy="3988676"/>
+                          </a:xfrm>
+                          <a:prstGeom prst="rect"/>
+                        </pic:spPr>
+                      </pic:pic>
+                    </a:graphicData>
+                  </a:graphic>
+                </wp:inline>
+              </w:drawing>
+            </w:r>
+          </w:p>
+          <w:p>
+            <w:pPr>
+              <w:spacing w:before="40" w:after="80"/>
+              <w:jc w:val="center"/>
+            </w:pPr>
+            <w:r>
+              <w:rPr>
+                <w:b/>
+                <w:color w:val="1B365D"/>
+                <w:sz w:val="17"/>
+              </w:rPr>
+              <w:t xml:space="preserve">Figure 2: </w:t>
+            </w:r>
+            <w:r>
+              <w:rPr>
+                <w:b/>
+                <w:color w:val="2D3748"/>
+                <w:sz w:val="17"/>
+              </w:rPr>
+              <w:t>Physical Hardware Prototype</w:t>
+            </w:r>
+            <w:r>
+              <w:br/>
+            </w:r>
+            <w:r>
+              <w:rPr>
+                <w:i/>
+                <w:color w:val="718096"/>
+                <w:sz w:val="15"/>
+              </w:rPr>
+              <w:t>Assembled handheld controller showing 1.8-inch ST7735 color TFT display, dual-axis potentiometric thumbstick gimbal, tactile switch array, and status LEDs.</w:t>
+            </w:r>
+          </w:p>
+        </w:tc>
+        <w:tc>
+          <w:tcPr>
+            <w:tcW w:type="dxa" w:w="4464"/>
+            <w:shd w:fill="FFFFFF"/>
+            <w:tcMar>
+              <w:top w:w="80" w:type="dxa"/>
+              <w:bottom w:w="100" w:type="dxa"/>
+              <w:left w:w="80" w:type="dxa"/>
+              <w:right w:w="80" w:type="dxa"/>
+            </w:tcMar>
+          </w:tcPr>
+          <w:p>
+            <w:pPr>
+              <w:keepNext/>
+              <w:spacing w:before="80" w:after="80"/>
+              <w:jc w:val="center"/>
+            </w:pPr>
+            <w:r>
+              <w:drawing>
+                <wp:inline xmlns:a="http://schemas.openxmlformats.org/drawingml/2006/main" xmlns:pic="http://schemas.openxmlformats.org/drawingml/2006/picture">
+                  <wp:extent cx="2514600" cy="3814057"/>
+                  <wp:docPr id="3" name="Picture 3"/>
+                  <wp:cNvGraphicFramePr>
+                    <a:graphicFrameLocks noChangeAspect="1"/>
+                  </wp:cNvGraphicFramePr>
+                  <a:graphic>
+                    <a:graphicData uri="http://schemas.openxmlformats.org/drawingml/2006/picture">
+                      <pic:pic>
+                        <pic:nvPicPr>
+                          <pic:cNvPr id="0" name="wiring.jpeg"/>
+                          <pic:cNvPicPr/>
+                        </pic:nvPicPr>
+                        <pic:blipFill>
+                          <a:blip r:embed="rId11"/>
+                          <a:stretch>
+                            <a:fillRect/>
+                          </a:stretch>
+                        </pic:blipFill>
+                        <pic:spPr>
+                          <a:xfrm>
+                            <a:off x="0" y="0"/>
+                            <a:ext cx="2514600" cy="3814057"/>
+                          </a:xfrm>
+                          <a:prstGeom prst="rect"/>
+                        </pic:spPr>
+                      </pic:pic>
+                    </a:graphicData>
+                  </a:graphic>
+                </wp:inline>
+              </w:drawing>
+            </w:r>
+          </w:p>
+          <w:p>
+            <w:pPr>
+              <w:spacing w:before="40" w:after="80"/>
+              <w:jc w:val="center"/>
+            </w:pPr>
+            <w:r>
+              <w:rPr>
+                <w:b/>
+                <w:color w:val="1B365D"/>
+                <w:sz w:val="17"/>
+              </w:rPr>
+              <w:t xml:space="preserve">Figure 3: </w:t>
+            </w:r>
+            <w:r>
+              <w:rPr>
+                <w:b/>
+                <w:color w:val="2D3748"/>
+                <w:sz w:val="17"/>
+              </w:rPr>
+              <w:t>Rear Circuit Wiring</w:t>
+            </w:r>
+            <w:r>
+              <w:br/>
+            </w:r>
+            <w:r>
+              <w:rPr>
+                <w:i/>
+                <w:color w:val="718096"/>
+                <w:sz w:val="15"/>
+              </w:rPr>
+              <w:t>Hand-wired point-to-point architecture displaying 240 MHz ESP32 host module, 27 MHz SPI display bus lines, SAR ADC input lines, and power decoupling.</w:t>
+            </w:r>
+          </w:p>
+        </w:tc>
+      </w:tr>
+    </w:tbl>
+    <w:p>
+      <w:pPr>
+        <w:spacing w:after="120"/>
+      </w:pPr>
+    </w:p>
+    <w:tbl>
+      <w:tblPr>
+        <w:tblW w:type="auto" w:w="0"/>
+        <w:jc w:val="center"/>
+        <w:tblLook w:firstColumn="1" w:firstRow="1" w:lastColumn="0" w:lastRow="0" w:noHBand="0" w:noVBand="1" w:val="04A0"/>
+        <w:tblBorders>
+          <w:top w:val="single" w:sz="4" w:space="0" w:color="E2E8F0"/>
+          <w:bottom w:val="single" w:sz="4" w:space="0" w:color="E2E8F0"/>
+          <w:left w:val="single" w:sz="4" w:space="0" w:color="E2E8F0"/>
+          <w:right w:val="single" w:sz="4" w:space="0" w:color="E2E8F0"/>
+          <w:insideH w:val="single" w:sz="4" w:space="0" w:color="E2E8F0"/>
+          <w:insideV w:val="single" w:sz="4" w:space="0" w:color="E2E8F0"/>
+        </w:tblBorders>
+      </w:tblPr>
+      <w:tblGrid>
+        <w:gridCol w:w="4680"/>
+        <w:gridCol w:w="4680"/>
+      </w:tblGrid>
+      <w:tr>
+        <w:tc>
+          <w:tcPr>
+            <w:tcW w:type="dxa" w:w="4464"/>
+            <w:shd w:fill="FFFFFF"/>
+            <w:tcMar>
+              <w:top w:w="80" w:type="dxa"/>
+              <w:bottom w:w="100" w:type="dxa"/>
+              <w:left w:w="80" w:type="dxa"/>
+              <w:right w:w="80" w:type="dxa"/>
+            </w:tcMar>
+          </w:tcPr>
+          <w:p>
+            <w:pPr>
+              <w:keepNext/>
+              <w:spacing w:before="80" w:after="80"/>
+              <w:jc w:val="center"/>
+            </w:pPr>
+            <w:r>
+              <w:drawing>
+                <wp:inline xmlns:a="http://schemas.openxmlformats.org/drawingml/2006/main" xmlns:pic="http://schemas.openxmlformats.org/drawingml/2006/picture">
+                  <wp:extent cx="2514600" cy="3914972"/>
+                  <wp:docPr id="4" name="Picture 4"/>
+                  <wp:cNvGraphicFramePr>
+                    <a:graphicFrameLocks noChangeAspect="1"/>
+                  </wp:cNvGraphicFramePr>
+                  <a:graphic>
+                    <a:graphicData uri="http://schemas.openxmlformats.org/drawingml/2006/picture">
+                      <pic:pic>
+                        <pic:nvPicPr>
+                          <pic:cNvPr id="0" name="snapback_radar.jpeg"/>
+                          <pic:cNvPicPr/>
+                        </pic:nvPicPr>
+                        <pic:blipFill>
+                          <a:blip r:embed="rId12"/>
+                          <a:stretch>
+                            <a:fillRect/>
+                          </a:stretch>
+                        </pic:blipFill>
+                        <pic:spPr>
+                          <a:xfrm>
+                            <a:off x="0" y="0"/>
+                            <a:ext cx="2514600" cy="3914972"/>
+                          </a:xfrm>
+                          <a:prstGeom prst="rect"/>
+                        </pic:spPr>
+                      </pic:pic>
+                    </a:graphicData>
+                  </a:graphic>
+                </wp:inline>
+              </w:drawing>
+            </w:r>
+          </w:p>
+          <w:p>
+            <w:pPr>
+              <w:spacing w:before="40" w:after="80"/>
+              <w:jc w:val="center"/>
+            </w:pPr>
+            <w:r>
+              <w:rPr>
+                <w:b/>
+                <w:color w:val="1B365D"/>
+                <w:sz w:val="17"/>
+              </w:rPr>
+              <w:t xml:space="preserve">Figure 4: </w:t>
+            </w:r>
+            <w:r>
+              <w:rPr>
+                <w:b/>
+                <w:color w:val="2D3748"/>
+                <w:sz w:val="17"/>
+              </w:rPr>
+              <w:t>Smart Snapback Visual Radar</w:t>
+            </w:r>
+            <w:r>
+              <w:br/>
+            </w:r>
+            <w:r>
+              <w:rPr>
+                <w:i/>
+                <w:color w:val="718096"/>
+                <w:sz w:val="15"/>
+              </w:rPr>
+              <w:t>Diagnostic telemetry screen displaying real-time deflection velocity estimation, origin latching, and active 50ms directional recoil damping.</w:t>
+            </w:r>
+          </w:p>
+        </w:tc>
+        <w:tc>
+          <w:tcPr>
+            <w:tcW w:type="dxa" w:w="4464"/>
+            <w:shd w:fill="FFFFFF"/>
+            <w:tcMar>
+              <w:top w:w="80" w:type="dxa"/>
+              <w:bottom w:w="100" w:type="dxa"/>
+              <w:left w:w="80" w:type="dxa"/>
+              <w:right w:w="80" w:type="dxa"/>
+            </w:tcMar>
+          </w:tcPr>
+          <w:p>
+            <w:pPr>
+              <w:keepNext/>
+              <w:spacing w:before="80" w:after="80"/>
+              <w:jc w:val="center"/>
+            </w:pPr>
+            <w:r>
+              <w:drawing>
+                <wp:inline xmlns:a="http://schemas.openxmlformats.org/drawingml/2006/main" xmlns:pic="http://schemas.openxmlformats.org/drawingml/2006/picture">
+                  <wp:extent cx="2514600" cy="4182651"/>
+                  <wp:docPr id="5" name="Picture 5"/>
+                  <wp:cNvGraphicFramePr>
+                    <a:graphicFrameLocks noChangeAspect="1"/>
+                  </wp:cNvGraphicFramePr>
+                  <a:graphic>
+                    <a:graphicData uri="http://schemas.openxmlformats.org/drawingml/2006/picture">
+                      <pic:pic>
+                        <pic:nvPicPr>
+                          <pic:cNvPr id="0" name="ram_usage.jpeg"/>
+                          <pic:cNvPicPr/>
+                        </pic:nvPicPr>
+                        <pic:blipFill>
+                          <a:blip r:embed="rId13"/>
+                          <a:stretch>
+                            <a:fillRect/>
+                          </a:stretch>
+                        </pic:blipFill>
+                        <pic:spPr>
+                          <a:xfrm>
+                            <a:off x="0" y="0"/>
+                            <a:ext cx="2514600" cy="4182651"/>
+                          </a:xfrm>
+                          <a:prstGeom prst="rect"/>
+                        </pic:spPr>
+                      </pic:pic>
+                    </a:graphicData>
+                  </a:graphic>
+                </wp:inline>
+              </w:drawing>
+            </w:r>
+          </w:p>
+          <w:p>
+            <w:pPr>
+              <w:spacing w:before="40" w:after="80"/>
+              <w:jc w:val="center"/>
+            </w:pPr>
+            <w:r>
+              <w:rPr>
+                <w:b/>
+                <w:color w:val="1B365D"/>
+                <w:sz w:val="17"/>
+              </w:rPr>
+              <w:t xml:space="preserve">Figure 5: </w:t>
+            </w:r>
+            <w:r>
+              <w:rPr>
+                <w:b/>
+                <w:color w:val="2D3748"/>
+                <w:sz w:val="17"/>
+              </w:rPr>
+              <w:t>System Memory Telemetry</w:t>
+            </w:r>
+            <w:r>
+              <w:br/>
+            </w:r>
+            <w:r>
+              <w:rPr>
+                <w:i/>
+                <w:color w:val="718096"/>
+                <w:sz w:val="15"/>
+              </w:rPr>
+              <w:t>On-screen diagnostic telemetry demonstrating 640-byte line-buffer footprint (0.6 KB) vs 41 KB full framebuffer, verifying 98.4% RAM savings.</w:t>
+            </w:r>
+          </w:p>
+        </w:tc>
+      </w:tr>
+    </w:tbl>
+    <w:p>
+      <w:pPr>
+        <w:spacing w:after="120"/>
+      </w:pPr>
+    </w:p>
+    <w:tbl>
+      <w:tblPr>
+        <w:tblW w:type="auto" w:w="0"/>
+        <w:jc w:val="center"/>
+        <w:tblLook w:firstColumn="1" w:firstRow="1" w:lastColumn="0" w:lastRow="0" w:noHBand="0" w:noVBand="1" w:val="04A0"/>
+        <w:tblBorders>
+          <w:top w:val="single" w:sz="4" w:space="0" w:color="E2E8F0"/>
+          <w:bottom w:val="single" w:sz="4" w:space="0" w:color="E2E8F0"/>
+          <w:left w:val="single" w:sz="4" w:space="0" w:color="E2E8F0"/>
+          <w:right w:val="single" w:sz="4" w:space="0" w:color="E2E8F0"/>
+          <w:insideH w:val="single" w:sz="4" w:space="0" w:color="E2E8F0"/>
+          <w:insideV w:val="single" w:sz="4" w:space="0" w:color="E2E8F0"/>
+        </w:tblBorders>
+      </w:tblPr>
+      <w:tblGrid>
+        <w:gridCol w:w="4680"/>
+        <w:gridCol w:w="4680"/>
+      </w:tblGrid>
+      <w:tr>
+        <w:tc>
+          <w:tcPr>
+            <w:tcW w:type="dxa" w:w="4464"/>
+            <w:shd w:fill="FFFFFF"/>
+            <w:tcMar>
+              <w:top w:w="80" w:type="dxa"/>
+              <w:bottom w:w="100" w:type="dxa"/>
+              <w:left w:w="80" w:type="dxa"/>
+              <w:right w:w="80" w:type="dxa"/>
+            </w:tcMar>
+          </w:tcPr>
+          <w:p>
+            <w:pPr>
+              <w:keepNext/>
+              <w:spacing w:before="80" w:after="80"/>
+              <w:jc w:val="center"/>
+            </w:pPr>
+            <w:r>
+              <w:drawing>
+                <wp:inline xmlns:a="http://schemas.openxmlformats.org/drawingml/2006/main" xmlns:pic="http://schemas.openxmlformats.org/drawingml/2006/picture">
+                  <wp:extent cx="2514600" cy="4153977"/>
+                  <wp:docPr id="6" name="Picture 6"/>
+                  <wp:cNvGraphicFramePr>
+                    <a:graphicFrameLocks noChangeAspect="1"/>
+                  </wp:cNvGraphicFramePr>
+                  <a:graphic>
+                    <a:graphicData uri="http://schemas.openxmlformats.org/drawingml/2006/picture">
+                      <pic:pic>
+                        <pic:nvPicPr>
+                          <pic:cNvPr id="0" name="wifi_scan.jpeg"/>
+                          <pic:cNvPicPr/>
+                        </pic:nvPicPr>
+                        <pic:blipFill>
+                          <a:blip r:embed="rId14"/>
+                          <a:stretch>
+                            <a:fillRect/>
+                          </a:stretch>
+                        </pic:blipFill>
+                        <pic:spPr>
+                          <a:xfrm>
+                            <a:off x="0" y="0"/>
+                            <a:ext cx="2514600" cy="4153977"/>
+                          </a:xfrm>
+                          <a:prstGeom prst="rect"/>
+                        </pic:spPr>
+                      </pic:pic>
+                    </a:graphicData>
+                  </a:graphic>
+                </wp:inline>
+              </w:drawing>
+            </w:r>
+          </w:p>
+          <w:p>
+            <w:pPr>
+              <w:spacing w:before="40" w:after="80"/>
+              <w:jc w:val="center"/>
+            </w:pPr>
+            <w:r>
+              <w:rPr>
+                <w:b/>
+                <w:color w:val="1B365D"/>
+                <w:sz w:val="17"/>
+              </w:rPr>
+              <w:t xml:space="preserve">Figure 6: </w:t>
+            </w:r>
+            <w:r>
+              <w:rPr>
+                <w:b/>
+                <w:color w:val="2D3748"/>
+                <w:sz w:val="17"/>
+              </w:rPr>
+              <w:t>Station Wi-Fi Scanner</w:t>
+            </w:r>
+            <w:r>
+              <w:br/>
+            </w:r>
+            <w:r>
+              <w:rPr>
+                <w:i/>
+                <w:color w:val="718096"/>
+                <w:sz w:val="15"/>
+              </w:rPr>
+              <w:t>Diagnostic interface scanning 2.4 GHz infrastructure networks to obtain cloud binary connectivity prior to automated Channel 1 radio re-locking.</w:t>
+            </w:r>
+          </w:p>
+        </w:tc>
+        <w:tc>
+          <w:tcPr>
+            <w:tcW w:type="dxa" w:w="4464"/>
+            <w:shd w:fill="FFFFFF"/>
+            <w:tcMar>
+              <w:top w:w="80" w:type="dxa"/>
+              <w:bottom w:w="100" w:type="dxa"/>
+              <w:left w:w="80" w:type="dxa"/>
+              <w:right w:w="80" w:type="dxa"/>
+            </w:tcMar>
+          </w:tcPr>
+          <w:p>
+            <w:pPr>
+              <w:keepNext/>
+              <w:spacing w:before="80" w:after="80"/>
+              <w:jc w:val="center"/>
+            </w:pPr>
+            <w:r>
+              <w:drawing>
+                <wp:inline xmlns:a="http://schemas.openxmlformats.org/drawingml/2006/main" xmlns:pic="http://schemas.openxmlformats.org/drawingml/2006/picture">
+                  <wp:extent cx="2514600" cy="2703871"/>
+                  <wp:docPr id="7" name="Picture 7"/>
+                  <wp:cNvGraphicFramePr>
+                    <a:graphicFrameLocks noChangeAspect="1"/>
+                  </wp:cNvGraphicFramePr>
+                  <a:graphic>
+                    <a:graphicData uri="http://schemas.openxmlformats.org/drawingml/2006/picture">
+                      <pic:pic>
+                        <pic:nvPicPr>
+                          <pic:cNvPr id="0" name="ota_composite.jpeg"/>
+                          <pic:cNvPicPr/>
+                        </pic:nvPicPr>
+                        <pic:blipFill>
+                          <a:blip r:embed="rId15"/>
+                          <a:stretch>
+                            <a:fillRect/>
+                          </a:stretch>
+                        </pic:blipFill>
+                        <pic:spPr>
+                          <a:xfrm>
+                            <a:off x="0" y="0"/>
+                            <a:ext cx="2514600" cy="2703871"/>
+                          </a:xfrm>
+                          <a:prstGeom prst="rect"/>
+                        </pic:spPr>
+                      </pic:pic>
+                    </a:graphicData>
+                  </a:graphic>
+                </wp:inline>
+              </w:drawing>
+            </w:r>
+          </w:p>
+          <w:p>
+            <w:pPr>
+              <w:spacing w:before="40" w:after="80"/>
+              <w:jc w:val="center"/>
+            </w:pPr>
+            <w:r>
+              <w:rPr>
+                <w:b/>
+                <w:color w:val="1B365D"/>
+                <w:sz w:val="17"/>
+              </w:rPr>
+              <w:t xml:space="preserve">Figure 7: </w:t>
+            </w:r>
+            <w:r>
+              <w:rPr>
+                <w:b/>
+                <w:color w:val="2D3748"/>
+                <w:sz w:val="17"/>
+              </w:rPr>
+              <w:t>Cloud OTA Update Suite</w:t>
+            </w:r>
+            <w:r>
+              <w:br/>
+            </w:r>
+            <w:r>
+              <w:rPr>
+                <w:i/>
+                <w:color w:val="718096"/>
+                <w:sz w:val="15"/>
+              </w:rPr>
+              <w:t>(Left) Automated GitHub Release version detection dialog. (Right) Live byte-count partition flashing progress stream without host PC.</w:t>
+            </w:r>
+          </w:p>
+        </w:tc>
+      </w:tr>
+    </w:tbl>
+    <w:p>
+      <w:pPr>
+        <w:spacing w:after="120"/>
+      </w:pPr>
     </w:p>
     <w:p>
       <w:pPr>
         <w:keepNext/>
-        <w:spacing w:before="240" w:after="80"/>
+        <w:spacing w:before="160" w:after="80"/>
         <w:jc w:val="center"/>
       </w:pPr>
       <w:r>
         <w:drawing>
           <wp:inline xmlns:a="http://schemas.openxmlformats.org/drawingml/2006/main" xmlns:pic="http://schemas.openxmlformats.org/drawingml/2006/picture">
-            <wp:extent cx="3291840" cy="5221539"/>
-            <wp:docPr id="2" name="Picture 2"/>
+            <wp:extent cx="5669280" cy="2521648"/>
+            <wp:docPr id="8" name="Picture 8"/>
             <wp:cNvGraphicFramePr>
               <a:graphicFrameLocks noChangeAspect="1"/>
             </wp:cNvGraphicFramePr>
@@ -865,11 +1459,11 @@
               <a:graphicData uri="http://schemas.openxmlformats.org/drawingml/2006/picture">
                 <pic:pic>
                   <pic:nvPicPr>
-                    <pic:cNvPr id="0" name="product.jpeg"/>
+                    <pic:cNvPr id="0" name="snapback_filmstrip.jpeg"/>
                     <pic:cNvPicPr/>
                   </pic:nvPicPr>
                   <pic:blipFill>
-                    <a:blip r:embed="rId10"/>
+                    <a:blip r:embed="rId16"/>
                     <a:stretch>
                       <a:fillRect/>
                     </a:stretch>
@@ -877,7 +1471,7 @@
                   <pic:spPr>
                     <a:xfrm>
                       <a:off x="0" y="0"/>
-                      <a:ext cx="3291840" cy="5221539"/>
+                      <a:ext cx="5669280" cy="2521648"/>
                     </a:xfrm>
                     <a:prstGeom prst="rect"/>
                   </pic:spPr>
@@ -890,525 +1484,7 @@
     </w:p>
     <w:p>
       <w:pPr>
-        <w:spacing w:before="40" w:after="440"/>
-        <w:jc w:val="center"/>
-      </w:pPr>
-      <w:r>
-        <w:rPr>
-          <w:b/>
-          <w:color w:val="1B365D"/>
-          <w:sz w:val="19"/>
-        </w:rPr>
-        <w:t xml:space="preserve">Figure 2: </w:t>
-      </w:r>
-      <w:r>
-        <w:rPr>
-          <w:b/>
-          <w:color w:val="2D3748"/>
-          <w:sz w:val="19"/>
-        </w:rPr>
-        <w:t>Physical Hardware Prototype of the Embedded Interactive Controller</w:t>
-      </w:r>
-      <w:r>
-        <w:t xml:space="preserve"> — </w:t>
-      </w:r>
-      <w:r>
-        <w:rPr>
-          <w:i/>
-          <w:color w:val="718096"/>
-          <w:sz w:val="17"/>
-        </w:rPr>
-        <w:t>Assembled handheld gaming console prototype incorporating the 1.8-inch 160×128 ST7735 color TFT display, dual-axis spring-centered resistive potentiometric thumbstick gimbal, 6-switch tactile input array, status LEDs, and breadboard/perfboard mounting.</w:t>
-      </w:r>
-    </w:p>
-    <w:p>
-      <w:pPr>
-        <w:keepNext/>
-        <w:spacing w:before="240" w:after="80"/>
-        <w:jc w:val="center"/>
-      </w:pPr>
-      <w:r>
-        <w:drawing>
-          <wp:inline xmlns:a="http://schemas.openxmlformats.org/drawingml/2006/main" xmlns:pic="http://schemas.openxmlformats.org/drawingml/2006/picture">
-            <wp:extent cx="3291840" cy="4992948"/>
-            <wp:docPr id="3" name="Picture 3"/>
-            <wp:cNvGraphicFramePr>
-              <a:graphicFrameLocks noChangeAspect="1"/>
-            </wp:cNvGraphicFramePr>
-            <a:graphic>
-              <a:graphicData uri="http://schemas.openxmlformats.org/drawingml/2006/picture">
-                <pic:pic>
-                  <pic:nvPicPr>
-                    <pic:cNvPr id="0" name="wiring.jpeg"/>
-                    <pic:cNvPicPr/>
-                  </pic:nvPicPr>
-                  <pic:blipFill>
-                    <a:blip r:embed="rId11"/>
-                    <a:stretch>
-                      <a:fillRect/>
-                    </a:stretch>
-                  </pic:blipFill>
-                  <pic:spPr>
-                    <a:xfrm>
-                      <a:off x="0" y="0"/>
-                      <a:ext cx="3291840" cy="4992948"/>
-                    </a:xfrm>
-                    <a:prstGeom prst="rect"/>
-                  </pic:spPr>
-                </pic:pic>
-              </a:graphicData>
-            </a:graphic>
-          </wp:inline>
-        </w:drawing>
-      </w:r>
-    </w:p>
-    <w:p>
-      <w:pPr>
-        <w:spacing w:before="40" w:after="440"/>
-        <w:jc w:val="center"/>
-      </w:pPr>
-      <w:r>
-        <w:rPr>
-          <w:b/>
-          <w:color w:val="1B365D"/>
-          <w:sz w:val="19"/>
-        </w:rPr>
-        <w:t xml:space="preserve">Figure 3: </w:t>
-      </w:r>
-      <w:r>
-        <w:rPr>
-          <w:b/>
-          <w:color w:val="2D3748"/>
-          <w:sz w:val="19"/>
-        </w:rPr>
-        <w:t>Rear Perfboard Point-to-Point Circuit Wiring &amp; Bus Interconnects</w:t>
-      </w:r>
-      <w:r>
-        <w:t xml:space="preserve"> — </w:t>
-      </w:r>
-      <w:r>
-        <w:rPr>
-          <w:i/>
-          <w:color w:val="718096"/>
-          <w:sz w:val="17"/>
-        </w:rPr>
-        <w:t>Hand-wired point-to-point circuit architecture displaying the 240 MHz ESP32 DevKit host module, 27 MHz SPI display bus lines (SCK, SDA, A0/DC, RESET, CS), analog ADC input lines (GPIO 34/35), tactile switch matrix, and 3.3V power decoupling network.</w:t>
-      </w:r>
-    </w:p>
-    <w:p>
-      <w:pPr>
-        <w:keepNext/>
-        <w:spacing w:before="240" w:after="80"/>
-        <w:jc w:val="center"/>
-      </w:pPr>
-      <w:r>
-        <w:drawing>
-          <wp:inline xmlns:a="http://schemas.openxmlformats.org/drawingml/2006/main" xmlns:pic="http://schemas.openxmlformats.org/drawingml/2006/picture">
-            <wp:extent cx="3291840" cy="5125054"/>
-            <wp:docPr id="4" name="Picture 4"/>
-            <wp:cNvGraphicFramePr>
-              <a:graphicFrameLocks noChangeAspect="1"/>
-            </wp:cNvGraphicFramePr>
-            <a:graphic>
-              <a:graphicData uri="http://schemas.openxmlformats.org/drawingml/2006/picture">
-                <pic:pic>
-                  <pic:nvPicPr>
-                    <pic:cNvPr id="0" name="snapback_radar.jpeg"/>
-                    <pic:cNvPicPr/>
-                  </pic:nvPicPr>
-                  <pic:blipFill>
-                    <a:blip r:embed="rId12"/>
-                    <a:stretch>
-                      <a:fillRect/>
-                    </a:stretch>
-                  </pic:blipFill>
-                  <pic:spPr>
-                    <a:xfrm>
-                      <a:off x="0" y="0"/>
-                      <a:ext cx="3291840" cy="5125054"/>
-                    </a:xfrm>
-                    <a:prstGeom prst="rect"/>
-                  </pic:spPr>
-                </pic:pic>
-              </a:graphicData>
-            </a:graphic>
-          </wp:inline>
-        </w:drawing>
-      </w:r>
-    </w:p>
-    <w:p>
-      <w:pPr>
-        <w:spacing w:before="40" w:after="440"/>
-        <w:jc w:val="center"/>
-      </w:pPr>
-      <w:r>
-        <w:rPr>
-          <w:b/>
-          <w:color w:val="1B365D"/>
-          <w:sz w:val="19"/>
-        </w:rPr>
-        <w:t xml:space="preserve">Figure 4: </w:t>
-      </w:r>
-      <w:r>
-        <w:rPr>
-          <w:b/>
-          <w:color w:val="2D3748"/>
-          <w:sz w:val="19"/>
-        </w:rPr>
-        <w:t>Real-Time Smart Snapback Visual Radar on Active Hardware</w:t>
-      </w:r>
-      <w:r>
-        <w:t xml:space="preserve"> — </w:t>
-      </w:r>
-      <w:r>
-        <w:rPr>
-          <w:i/>
-          <w:color w:val="718096"/>
-          <w:sz w:val="17"/>
-        </w:rPr>
-        <w:t>Physical console TFT displaying real-time diagnostic telemetry: active kinematic spring damping indicator, instantaneous coordinate deflection meter, and directional velocity vector, verifying live rebound suppression without phase lag.</w:t>
-      </w:r>
-    </w:p>
-    <w:p>
-      <w:pPr>
-        <w:keepNext/>
-        <w:spacing w:before="240" w:after="80"/>
-        <w:jc w:val="center"/>
-      </w:pPr>
-      <w:r>
-        <w:drawing>
-          <wp:inline xmlns:a="http://schemas.openxmlformats.org/drawingml/2006/main" xmlns:pic="http://schemas.openxmlformats.org/drawingml/2006/picture">
-            <wp:extent cx="3291840" cy="5475470"/>
-            <wp:docPr id="5" name="Picture 5"/>
-            <wp:cNvGraphicFramePr>
-              <a:graphicFrameLocks noChangeAspect="1"/>
-            </wp:cNvGraphicFramePr>
-            <a:graphic>
-              <a:graphicData uri="http://schemas.openxmlformats.org/drawingml/2006/picture">
-                <pic:pic>
-                  <pic:nvPicPr>
-                    <pic:cNvPr id="0" name="ram_usage.jpeg"/>
-                    <pic:cNvPicPr/>
-                  </pic:nvPicPr>
-                  <pic:blipFill>
-                    <a:blip r:embed="rId13"/>
-                    <a:stretch>
-                      <a:fillRect/>
-                    </a:stretch>
-                  </pic:blipFill>
-                  <pic:spPr>
-                    <a:xfrm>
-                      <a:off x="0" y="0"/>
-                      <a:ext cx="3291840" cy="5475470"/>
-                    </a:xfrm>
-                    <a:prstGeom prst="rect"/>
-                  </pic:spPr>
-                </pic:pic>
-              </a:graphicData>
-            </a:graphic>
-          </wp:inline>
-        </w:drawing>
-      </w:r>
-    </w:p>
-    <w:p>
-      <w:pPr>
-        <w:spacing w:before="40" w:after="440"/>
-        <w:jc w:val="center"/>
-      </w:pPr>
-      <w:r>
-        <w:rPr>
-          <w:b/>
-          <w:color w:val="1B365D"/>
-          <w:sz w:val="19"/>
-        </w:rPr>
-        <w:t xml:space="preserve">Figure 5: </w:t>
-      </w:r>
-      <w:r>
-        <w:rPr>
-          <w:b/>
-          <w:color w:val="2D3748"/>
-          <w:sz w:val="19"/>
-        </w:rPr>
-        <w:t>System Memory Diagnostic Telemetry &amp; Free SRAM Verification</w:t>
-      </w:r>
-      <w:r>
-        <w:t xml:space="preserve"> — </w:t>
-      </w:r>
-      <w:r>
-        <w:rPr>
-          <w:i/>
-          <w:color w:val="718096"/>
-          <w:sz w:val="17"/>
-        </w:rPr>
-        <w:t>On-screen diagnostic telemetry demonstrating the 640-byte dual line-buffer display footprint (0.6 KB) compared against a traditional 41 KB full framebuffer (98.4% RAM savings), verifying sufficient free internal heap for concurrent RF baseband packet queues.</w:t>
-      </w:r>
-    </w:p>
-    <w:p>
-      <w:pPr>
-        <w:keepNext/>
-        <w:spacing w:before="240" w:after="80"/>
-        <w:jc w:val="center"/>
-      </w:pPr>
-      <w:r>
-        <w:drawing>
-          <wp:inline xmlns:a="http://schemas.openxmlformats.org/drawingml/2006/main" xmlns:pic="http://schemas.openxmlformats.org/drawingml/2006/picture">
-            <wp:extent cx="3291840" cy="5437934"/>
-            <wp:docPr id="6" name="Picture 6"/>
-            <wp:cNvGraphicFramePr>
-              <a:graphicFrameLocks noChangeAspect="1"/>
-            </wp:cNvGraphicFramePr>
-            <a:graphic>
-              <a:graphicData uri="http://schemas.openxmlformats.org/drawingml/2006/picture">
-                <pic:pic>
-                  <pic:nvPicPr>
-                    <pic:cNvPr id="0" name="wifi_scan.jpeg"/>
-                    <pic:cNvPicPr/>
-                  </pic:nvPicPr>
-                  <pic:blipFill>
-                    <a:blip r:embed="rId14"/>
-                    <a:stretch>
-                      <a:fillRect/>
-                    </a:stretch>
-                  </pic:blipFill>
-                  <pic:spPr>
-                    <a:xfrm>
-                      <a:off x="0" y="0"/>
-                      <a:ext cx="3291840" cy="5437934"/>
-                    </a:xfrm>
-                    <a:prstGeom prst="rect"/>
-                  </pic:spPr>
-                </pic:pic>
-              </a:graphicData>
-            </a:graphic>
-          </wp:inline>
-        </w:drawing>
-      </w:r>
-    </w:p>
-    <w:p>
-      <w:pPr>
-        <w:spacing w:before="40" w:after="440"/>
-        <w:jc w:val="center"/>
-      </w:pPr>
-      <w:r>
-        <w:rPr>
-          <w:b/>
-          <w:color w:val="1B365D"/>
-          <w:sz w:val="19"/>
-        </w:rPr>
-        <w:t xml:space="preserve">Figure 6: </w:t>
-      </w:r>
-      <w:r>
-        <w:rPr>
-          <w:b/>
-          <w:color w:val="2D3748"/>
-          <w:sz w:val="19"/>
-        </w:rPr>
-        <w:t>Station-Mode Wi-Fi Access Point Discovery &amp; Scanning Interface</w:t>
-      </w:r>
-      <w:r>
-        <w:t xml:space="preserve"> — </w:t>
-      </w:r>
-      <w:r>
-        <w:rPr>
-          <w:i/>
-          <w:color w:val="718096"/>
-          <w:sz w:val="17"/>
-        </w:rPr>
-        <w:t>Diagnostic menu interface scanning 2.4 GHz infrastructure networks to obtain IP connectivity for cloud firmware binaries, prior to automated RF physical layer baseband re-locking to dedicated peer-to-peer Channel 1.</w:t>
-      </w:r>
-    </w:p>
-    <w:p>
-      <w:pPr>
-        <w:keepNext/>
-        <w:spacing w:before="240" w:after="80"/>
-        <w:jc w:val="center"/>
-      </w:pPr>
-      <w:r>
-        <w:drawing>
-          <wp:inline xmlns:a="http://schemas.openxmlformats.org/drawingml/2006/main" xmlns:pic="http://schemas.openxmlformats.org/drawingml/2006/picture">
-            <wp:extent cx="3200400" cy="7062952"/>
-            <wp:docPr id="7" name="Picture 7"/>
-            <wp:cNvGraphicFramePr>
-              <a:graphicFrameLocks noChangeAspect="1"/>
-            </wp:cNvGraphicFramePr>
-            <a:graphic>
-              <a:graphicData uri="http://schemas.openxmlformats.org/drawingml/2006/picture">
-                <pic:pic>
-                  <pic:nvPicPr>
-                    <pic:cNvPr id="0" name="ota_update_popup.jpeg"/>
-                    <pic:cNvPicPr/>
-                  </pic:nvPicPr>
-                  <pic:blipFill>
-                    <a:blip r:embed="rId15"/>
-                    <a:stretch>
-                      <a:fillRect/>
-                    </a:stretch>
-                  </pic:blipFill>
-                  <pic:spPr>
-                    <a:xfrm>
-                      <a:off x="0" y="0"/>
-                      <a:ext cx="3200400" cy="7062952"/>
-                    </a:xfrm>
-                    <a:prstGeom prst="rect"/>
-                  </pic:spPr>
-                </pic:pic>
-              </a:graphicData>
-            </a:graphic>
-          </wp:inline>
-        </w:drawing>
-      </w:r>
-    </w:p>
-    <w:p>
-      <w:pPr>
-        <w:spacing w:before="40" w:after="440"/>
-        <w:jc w:val="center"/>
-      </w:pPr>
-      <w:r>
-        <w:rPr>
-          <w:b/>
-          <w:color w:val="1B365D"/>
-          <w:sz w:val="19"/>
-        </w:rPr>
-        <w:t xml:space="preserve">Figure 7A: </w:t>
-      </w:r>
-      <w:r>
-        <w:rPr>
-          <w:b/>
-          <w:color w:val="2D3748"/>
-          <w:sz w:val="19"/>
-        </w:rPr>
-        <w:t>Cloud OTA Firmware Update Version Detection Dialog</w:t>
-      </w:r>
-      <w:r>
-        <w:t xml:space="preserve"> — </w:t>
-      </w:r>
-      <w:r>
-        <w:rPr>
-          <w:i/>
-          <w:color w:val="718096"/>
-          <w:sz w:val="17"/>
-        </w:rPr>
-        <w:t>On-console dialog displaying automatic GitHub release tag detection and firmware binary version comparison (Remote: v2.3.9 vs Current: v2.3.8) prior to partition streaming.</w:t>
-      </w:r>
-    </w:p>
-    <w:p>
-      <w:pPr>
-        <w:keepNext/>
-        <w:spacing w:before="240" w:after="80"/>
-        <w:jc w:val="center"/>
-      </w:pPr>
-      <w:r>
-        <w:drawing>
-          <wp:inline xmlns:a="http://schemas.openxmlformats.org/drawingml/2006/main" xmlns:pic="http://schemas.openxmlformats.org/drawingml/2006/picture">
-            <wp:extent cx="3200400" cy="7062952"/>
-            <wp:docPr id="8" name="Picture 8"/>
-            <wp:cNvGraphicFramePr>
-              <a:graphicFrameLocks noChangeAspect="1"/>
-            </wp:cNvGraphicFramePr>
-            <a:graphic>
-              <a:graphicData uri="http://schemas.openxmlformats.org/drawingml/2006/picture">
-                <pic:pic>
-                  <pic:nvPicPr>
-                    <pic:cNvPr id="0" name="ota_update_progress.jpeg"/>
-                    <pic:cNvPicPr/>
-                  </pic:nvPicPr>
-                  <pic:blipFill>
-                    <a:blip r:embed="rId16"/>
-                    <a:stretch>
-                      <a:fillRect/>
-                    </a:stretch>
-                  </pic:blipFill>
-                  <pic:spPr>
-                    <a:xfrm>
-                      <a:off x="0" y="0"/>
-                      <a:ext cx="3200400" cy="7062952"/>
-                    </a:xfrm>
-                    <a:prstGeom prst="rect"/>
-                  </pic:spPr>
-                </pic:pic>
-              </a:graphicData>
-            </a:graphic>
-          </wp:inline>
-        </w:drawing>
-      </w:r>
-    </w:p>
-    <w:p>
-      <w:pPr>
-        <w:spacing w:before="40" w:after="440"/>
-        <w:jc w:val="center"/>
-      </w:pPr>
-      <w:r>
-        <w:rPr>
-          <w:b/>
-          <w:color w:val="1B365D"/>
-          <w:sz w:val="19"/>
-        </w:rPr>
-        <w:t xml:space="preserve">Figure 7B: </w:t>
-      </w:r>
-      <w:r>
-        <w:rPr>
-          <w:b/>
-          <w:color w:val="2D3748"/>
-          <w:sz w:val="19"/>
-        </w:rPr>
-        <w:t>Cloud OTA Firmware Streaming &amp; Partition Flashing Telemetry</w:t>
-      </w:r>
-      <w:r>
-        <w:t xml:space="preserve"> — </w:t>
-      </w:r>
-      <w:r>
-        <w:rPr>
-          <w:i/>
-          <w:color w:val="718096"/>
-          <w:sz w:val="17"/>
-        </w:rPr>
-        <w:t>Live hardware display showing active flash writing progress (15%, 189/1260 KB) streamed over HTTPS directly from cloud repositories without host computer intervention.</w:t>
-      </w:r>
-    </w:p>
-    <w:p>
-      <w:pPr>
-        <w:keepNext/>
-        <w:spacing w:before="240" w:after="80"/>
-        <w:jc w:val="center"/>
-      </w:pPr>
-      <w:r>
-        <w:drawing>
-          <wp:inline xmlns:a="http://schemas.openxmlformats.org/drawingml/2006/main" xmlns:pic="http://schemas.openxmlformats.org/drawingml/2006/picture">
-            <wp:extent cx="5120640" cy="2277618"/>
-            <wp:docPr id="9" name="Picture 9"/>
-            <wp:cNvGraphicFramePr>
-              <a:graphicFrameLocks noChangeAspect="1"/>
-            </wp:cNvGraphicFramePr>
-            <a:graphic>
-              <a:graphicData uri="http://schemas.openxmlformats.org/drawingml/2006/picture">
-                <pic:pic>
-                  <pic:nvPicPr>
-                    <pic:cNvPr id="0" name="snapback_filmstrip.jpeg"/>
-                    <pic:cNvPicPr/>
-                  </pic:nvPicPr>
-                  <pic:blipFill>
-                    <a:blip r:embed="rId17"/>
-                    <a:stretch>
-                      <a:fillRect/>
-                    </a:stretch>
-                  </pic:blipFill>
-                  <pic:spPr>
-                    <a:xfrm>
-                      <a:off x="0" y="0"/>
-                      <a:ext cx="5120640" cy="2277618"/>
-                    </a:xfrm>
-                    <a:prstGeom prst="rect"/>
-                  </pic:spPr>
-                </pic:pic>
-              </a:graphicData>
-            </a:graphic>
-          </wp:inline>
-        </w:drawing>
-      </w:r>
-    </w:p>
-    <w:p>
-      <w:pPr>
-        <w:spacing w:before="40" w:after="440"/>
+        <w:spacing w:before="40" w:after="280"/>
         <w:jc w:val="center"/>
       </w:pPr>
       <w:r>
@@ -1442,14 +1518,14 @@
     <w:p>
       <w:pPr>
         <w:keepNext/>
-        <w:spacing w:before="240" w:after="80"/>
+        <w:spacing w:before="160" w:after="80"/>
         <w:jc w:val="center"/>
       </w:pPr>
       <w:r>
         <w:drawing>
           <wp:inline xmlns:a="http://schemas.openxmlformats.org/drawingml/2006/main" xmlns:pic="http://schemas.openxmlformats.org/drawingml/2006/picture">
-            <wp:extent cx="5120640" cy="2224278"/>
-            <wp:docPr id="10" name="Picture 10"/>
+            <wp:extent cx="5669280" cy="2462594"/>
+            <wp:docPr id="9" name="Picture 9"/>
             <wp:cNvGraphicFramePr>
               <a:graphicFrameLocks noChangeAspect="1"/>
             </wp:cNvGraphicFramePr>
@@ -1461,7 +1537,7 @@
                     <pic:cNvPicPr/>
                   </pic:nvPicPr>
                   <pic:blipFill>
-                    <a:blip r:embed="rId18"/>
+                    <a:blip r:embed="rId17"/>
                     <a:stretch>
                       <a:fillRect/>
                     </a:stretch>
@@ -1469,7 +1545,7 @@
                   <pic:spPr>
                     <a:xfrm>
                       <a:off x="0" y="0"/>
-                      <a:ext cx="5120640" cy="2224278"/>
+                      <a:ext cx="5669280" cy="2462594"/>
                     </a:xfrm>
                     <a:prstGeom prst="rect"/>
                   </pic:spPr>
@@ -1482,7 +1558,7 @@
     </w:p>
     <w:p>
       <w:pPr>
-        <w:spacing w:before="40" w:after="440"/>
+        <w:spacing w:before="40" w:after="280"/>
         <w:jc w:val="center"/>
       </w:pPr>
       <w:r>

</xml_diff>

<commit_message>
docs(patent): polish Word document with 0.75in margins, borderless image gallery, and 4K vector patent schematic
</commit_message>
<xml_diff>
--- a/docs/Meantendo_University_Patent_Submission.docx
+++ b/docs/Meantendo_University_Patent_Submission.docx
@@ -4,14 +4,14 @@
   <w:body>
     <w:p>
       <w:pPr>
-        <w:spacing w:after="40"/>
+        <w:spacing w:before="0" w:after="40"/>
         <w:jc w:val="center"/>
       </w:pPr>
       <w:r>
         <w:rPr>
           <w:b/>
-          <w:color w:val="4A5568"/>
-          <w:sz w:val="19"/>
+          <w:color w:val="64748B"/>
+          <w:sz w:val="18"/>
         </w:rPr>
         <w:t>THE PATENTS ACT, 1970 (39 OF 1970) &amp; THE PATENTS RULES, 2003</w:t>
         <w:br/>
@@ -20,28 +20,28 @@
     </w:p>
     <w:p>
       <w:pPr>
-        <w:spacing w:after="280"/>
+        <w:spacing w:after="200"/>
         <w:jc w:val="center"/>
       </w:pPr>
       <w:r>
         <w:rPr>
           <w:i/>
-          <w:color w:val="718096"/>
-          <w:sz w:val="17"/>
+          <w:color w:val="94A3B8"/>
+          <w:sz w:val="16"/>
         </w:rPr>
         <w:t>(See Section 10 and Rule 13 — University IPR Cell Submission Format)</w:t>
       </w:r>
     </w:p>
     <w:p>
       <w:pPr>
-        <w:spacing w:after="320"/>
+        <w:spacing w:after="240"/>
         <w:jc w:val="center"/>
       </w:pPr>
       <w:r>
         <w:rPr>
           <w:b/>
-          <w:color w:val="1B365D"/>
-          <w:sz w:val="26"/>
+          <w:color w:val="0F172A"/>
+          <w:sz w:val="24"/>
         </w:rPr>
         <w:t>AN APPARATUS AND METHOD FOR KINEMATIC TRANSDUCER SIGNAL CONDITIONING AND DETERMINISTIC AD-HOC RF TELEMETRY IN AN EMBEDDED INTERACTIVE CONTROLLER</w:t>
       </w:r>
@@ -52,28 +52,28 @@
         <w:jc w:val="center"/>
         <w:tblLook w:firstColumn="1" w:firstRow="1" w:lastColumn="0" w:lastRow="0" w:noHBand="0" w:noVBand="1" w:val="04A0"/>
         <w:tblBorders>
-          <w:top w:val="single" w:sz="4" w:space="0" w:color="CBD5E0"/>
-          <w:bottom w:val="single" w:sz="4" w:space="0" w:color="CBD5E0"/>
+          <w:top w:val="single" w:sz="4" w:space="0" w:color="E2E8F0"/>
+          <w:bottom w:val="single" w:sz="4" w:space="0" w:color="E2E8F0"/>
           <w:left w:val="none"/>
           <w:right w:val="none"/>
-          <w:insideH w:val="single" w:sz="4" w:space="0" w:color="CBD5E0"/>
+          <w:insideH w:val="single" w:sz="4" w:space="0" w:color="E2E8F0"/>
           <w:insideV w:val="none"/>
         </w:tblBorders>
       </w:tblPr>
       <w:tblGrid>
-        <w:gridCol w:w="4680"/>
-        <w:gridCol w:w="4680"/>
+        <w:gridCol w:w="5040"/>
+        <w:gridCol w:w="5040"/>
       </w:tblGrid>
       <w:tr>
         <w:tc>
           <w:tcPr>
             <w:tcW w:type="dxa" w:w="3168"/>
-            <w:shd w:fill="EDF2F7"/>
+            <w:shd w:fill="F8FAFC"/>
             <w:tcMar>
-              <w:top w:w="80" w:type="dxa"/>
-              <w:bottom w:w="80" w:type="dxa"/>
-              <w:left w:w="120" w:type="dxa"/>
-              <w:right w:w="120" w:type="dxa"/>
+              <w:top w:w="60" w:type="dxa"/>
+              <w:bottom w:w="60" w:type="dxa"/>
+              <w:left w:w="100" w:type="dxa"/>
+              <w:right w:w="100" w:type="dxa"/>
             </w:tcMar>
           </w:tcPr>
           <w:p>
@@ -83,7 +83,7 @@
             <w:r>
               <w:rPr>
                 <w:b/>
-                <w:color w:val="2D3748"/>
+                <w:color w:val="1E293B"/>
                 <w:sz w:val="17"/>
               </w:rPr>
               <w:t>Applicant / Inventor Name</w:t>
@@ -92,13 +92,13 @@
         </w:tc>
         <w:tc>
           <w:tcPr>
-            <w:tcW w:type="dxa" w:w="6192"/>
-            <w:shd w:fill="F7FAFC"/>
+            <w:tcW w:type="dxa" w:w="6912"/>
+            <w:shd w:fill="FFFFFF"/>
             <w:tcMar>
-              <w:top w:w="80" w:type="dxa"/>
-              <w:bottom w:w="80" w:type="dxa"/>
-              <w:left w:w="120" w:type="dxa"/>
-              <w:right w:w="120" w:type="dxa"/>
+              <w:top w:w="60" w:type="dxa"/>
+              <w:bottom w:w="60" w:type="dxa"/>
+              <w:left w:w="100" w:type="dxa"/>
+              <w:right w:w="100" w:type="dxa"/>
             </w:tcMar>
           </w:tcPr>
           <w:p>
@@ -107,7 +107,7 @@
             </w:pPr>
             <w:r>
               <w:rPr>
-                <w:color w:val="4A5568"/>
+                <w:color w:val="475569"/>
                 <w:sz w:val="17"/>
               </w:rPr>
               <w:t>Ankit Chetri (Gender: Male)</w:t>
@@ -119,12 +119,12 @@
         <w:tc>
           <w:tcPr>
             <w:tcW w:type="dxa" w:w="3168"/>
-            <w:shd w:fill="EDF2F7"/>
+            <w:shd w:fill="F8FAFC"/>
             <w:tcMar>
-              <w:top w:w="80" w:type="dxa"/>
-              <w:bottom w:w="80" w:type="dxa"/>
-              <w:left w:w="120" w:type="dxa"/>
-              <w:right w:w="120" w:type="dxa"/>
+              <w:top w:w="60" w:type="dxa"/>
+              <w:bottom w:w="60" w:type="dxa"/>
+              <w:left w:w="100" w:type="dxa"/>
+              <w:right w:w="100" w:type="dxa"/>
             </w:tcMar>
           </w:tcPr>
           <w:p>
@@ -134,7 +134,7 @@
             <w:r>
               <w:rPr>
                 <w:b/>
-                <w:color w:val="2D3748"/>
+                <w:color w:val="1E293B"/>
                 <w:sz w:val="17"/>
               </w:rPr>
               <w:t>Nationality &amp; Residence</w:t>
@@ -143,13 +143,13 @@
         </w:tc>
         <w:tc>
           <w:tcPr>
-            <w:tcW w:type="dxa" w:w="6192"/>
-            <w:shd w:fill="FFFFFF"/>
+            <w:tcW w:type="dxa" w:w="6912"/>
+            <w:shd w:fill="F8FAFC"/>
             <w:tcMar>
-              <w:top w:w="80" w:type="dxa"/>
-              <w:bottom w:w="80" w:type="dxa"/>
-              <w:left w:w="120" w:type="dxa"/>
-              <w:right w:w="120" w:type="dxa"/>
+              <w:top w:w="60" w:type="dxa"/>
+              <w:bottom w:w="60" w:type="dxa"/>
+              <w:left w:w="100" w:type="dxa"/>
+              <w:right w:w="100" w:type="dxa"/>
             </w:tcMar>
           </w:tcPr>
           <w:p>
@@ -158,7 +158,7 @@
             </w:pPr>
             <w:r>
               <w:rPr>
-                <w:color w:val="4A5568"/>
+                <w:color w:val="475569"/>
                 <w:sz w:val="17"/>
               </w:rPr>
               <w:t>Indian / Resident of India</w:t>
@@ -170,12 +170,12 @@
         <w:tc>
           <w:tcPr>
             <w:tcW w:type="dxa" w:w="3168"/>
-            <w:shd w:fill="EDF2F7"/>
+            <w:shd w:fill="F8FAFC"/>
             <w:tcMar>
-              <w:top w:w="80" w:type="dxa"/>
-              <w:bottom w:w="80" w:type="dxa"/>
-              <w:left w:w="120" w:type="dxa"/>
-              <w:right w:w="120" w:type="dxa"/>
+              <w:top w:w="60" w:type="dxa"/>
+              <w:bottom w:w="60" w:type="dxa"/>
+              <w:left w:w="100" w:type="dxa"/>
+              <w:right w:w="100" w:type="dxa"/>
             </w:tcMar>
           </w:tcPr>
           <w:p>
@@ -185,7 +185,7 @@
             <w:r>
               <w:rPr>
                 <w:b/>
-                <w:color w:val="2D3748"/>
+                <w:color w:val="1E293B"/>
                 <w:sz w:val="17"/>
               </w:rPr>
               <w:t>Affiliated Institution</w:t>
@@ -194,13 +194,13 @@
         </w:tc>
         <w:tc>
           <w:tcPr>
-            <w:tcW w:type="dxa" w:w="6192"/>
-            <w:shd w:fill="F7FAFC"/>
+            <w:tcW w:type="dxa" w:w="6912"/>
+            <w:shd w:fill="FFFFFF"/>
             <w:tcMar>
-              <w:top w:w="80" w:type="dxa"/>
-              <w:bottom w:w="80" w:type="dxa"/>
-              <w:left w:w="120" w:type="dxa"/>
-              <w:right w:w="120" w:type="dxa"/>
+              <w:top w:w="60" w:type="dxa"/>
+              <w:bottom w:w="60" w:type="dxa"/>
+              <w:left w:w="100" w:type="dxa"/>
+              <w:right w:w="100" w:type="dxa"/>
             </w:tcMar>
           </w:tcPr>
           <w:p>
@@ -209,7 +209,7 @@
             </w:pPr>
             <w:r>
               <w:rPr>
-                <w:color w:val="4A5568"/>
+                <w:color w:val="475569"/>
                 <w:sz w:val="17"/>
               </w:rPr>
               <w:t>Department of Computer Science &amp; Engineering (CSE), Manipal University Jaipur, Dehmi Kalan, Jaipur-Ajmer Expressway, Jaipur, Rajasthan - 303007, India</w:t>
@@ -221,12 +221,12 @@
         <w:tc>
           <w:tcPr>
             <w:tcW w:type="dxa" w:w="3168"/>
-            <w:shd w:fill="EDF2F7"/>
+            <w:shd w:fill="F8FAFC"/>
             <w:tcMar>
-              <w:top w:w="80" w:type="dxa"/>
-              <w:bottom w:w="80" w:type="dxa"/>
-              <w:left w:w="120" w:type="dxa"/>
-              <w:right w:w="120" w:type="dxa"/>
+              <w:top w:w="60" w:type="dxa"/>
+              <w:bottom w:w="60" w:type="dxa"/>
+              <w:left w:w="100" w:type="dxa"/>
+              <w:right w:w="100" w:type="dxa"/>
             </w:tcMar>
           </w:tcPr>
           <w:p>
@@ -236,7 +236,7 @@
             <w:r>
               <w:rPr>
                 <w:b/>
-                <w:color w:val="2D3748"/>
+                <w:color w:val="1E293B"/>
                 <w:sz w:val="17"/>
               </w:rPr>
               <w:t>Filing Track &amp; Classification</w:t>
@@ -245,13 +245,13 @@
         </w:tc>
         <w:tc>
           <w:tcPr>
-            <w:tcW w:type="dxa" w:w="6192"/>
-            <w:shd w:fill="FFFFFF"/>
+            <w:tcW w:type="dxa" w:w="6912"/>
+            <w:shd w:fill="F8FAFC"/>
             <w:tcMar>
-              <w:top w:w="80" w:type="dxa"/>
-              <w:bottom w:w="80" w:type="dxa"/>
-              <w:left w:w="120" w:type="dxa"/>
-              <w:right w:w="120" w:type="dxa"/>
+              <w:top w:w="60" w:type="dxa"/>
+              <w:bottom w:w="60" w:type="dxa"/>
+              <w:left w:w="100" w:type="dxa"/>
+              <w:right w:w="100" w:type="dxa"/>
             </w:tcMar>
           </w:tcPr>
           <w:p>
@@ -260,7 +260,7 @@
             </w:pPr>
             <w:r>
               <w:rPr>
-                <w:color w:val="4A5568"/>
+                <w:color w:val="475569"/>
                 <w:sz w:val="17"/>
               </w:rPr>
               <w:t>Publication + Examination Process | IPC: G06F 3/02, G06F 3/0338, H04W 4/00, H04L 67/12</w:t>
@@ -272,12 +272,12 @@
         <w:tc>
           <w:tcPr>
             <w:tcW w:type="dxa" w:w="3168"/>
-            <w:shd w:fill="EDF2F7"/>
+            <w:shd w:fill="F8FAFC"/>
             <w:tcMar>
-              <w:top w:w="80" w:type="dxa"/>
-              <w:bottom w:w="80" w:type="dxa"/>
-              <w:left w:w="120" w:type="dxa"/>
-              <w:right w:w="120" w:type="dxa"/>
+              <w:top w:w="60" w:type="dxa"/>
+              <w:bottom w:w="60" w:type="dxa"/>
+              <w:left w:w="100" w:type="dxa"/>
+              <w:right w:w="100" w:type="dxa"/>
             </w:tcMar>
           </w:tcPr>
           <w:p>
@@ -287,7 +287,7 @@
             <w:r>
               <w:rPr>
                 <w:b/>
-                <w:color w:val="2D3748"/>
+                <w:color w:val="1E293B"/>
                 <w:sz w:val="17"/>
               </w:rPr>
               <w:t>Previous Publication Details</w:t>
@@ -296,13 +296,13 @@
         </w:tc>
         <w:tc>
           <w:tcPr>
-            <w:tcW w:type="dxa" w:w="6192"/>
-            <w:shd w:fill="F7FAFC"/>
+            <w:tcW w:type="dxa" w:w="6912"/>
+            <w:shd w:fill="FFFFFF"/>
             <w:tcMar>
-              <w:top w:w="80" w:type="dxa"/>
-              <w:bottom w:w="80" w:type="dxa"/>
-              <w:left w:w="120" w:type="dxa"/>
-              <w:right w:w="120" w:type="dxa"/>
+              <w:top w:w="60" w:type="dxa"/>
+              <w:bottom w:w="60" w:type="dxa"/>
+              <w:left w:w="100" w:type="dxa"/>
+              <w:right w:w="100" w:type="dxa"/>
             </w:tcMar>
           </w:tcPr>
           <w:p>
@@ -311,7 +311,7 @@
             </w:pPr>
             <w:r>
               <w:rPr>
-                <w:color w:val="4A5568"/>
+                <w:color w:val="475569"/>
                 <w:sz w:val="17"/>
               </w:rPr>
               <w:t>None. (Ensuring Absolute Novelty under Section 2(1)(j) of The Patents Act, 1970)</w:t>
@@ -323,12 +323,12 @@
         <w:tc>
           <w:tcPr>
             <w:tcW w:type="dxa" w:w="3168"/>
-            <w:shd w:fill="EDF2F7"/>
+            <w:shd w:fill="F8FAFC"/>
             <w:tcMar>
-              <w:top w:w="80" w:type="dxa"/>
-              <w:bottom w:w="80" w:type="dxa"/>
-              <w:left w:w="120" w:type="dxa"/>
-              <w:right w:w="120" w:type="dxa"/>
+              <w:top w:w="60" w:type="dxa"/>
+              <w:bottom w:w="60" w:type="dxa"/>
+              <w:left w:w="100" w:type="dxa"/>
+              <w:right w:w="100" w:type="dxa"/>
             </w:tcMar>
           </w:tcPr>
           <w:p>
@@ -338,7 +338,7 @@
             <w:r>
               <w:rPr>
                 <w:b/>
-                <w:color w:val="2D3748"/>
+                <w:color w:val="1E293B"/>
                 <w:sz w:val="17"/>
               </w:rPr>
               <w:t>Field of Application</w:t>
@@ -347,13 +347,13 @@
         </w:tc>
         <w:tc>
           <w:tcPr>
-            <w:tcW w:type="dxa" w:w="6192"/>
-            <w:shd w:fill="FFFFFF"/>
+            <w:tcW w:type="dxa" w:w="6912"/>
+            <w:shd w:fill="F8FAFC"/>
             <w:tcMar>
-              <w:top w:w="80" w:type="dxa"/>
-              <w:bottom w:w="80" w:type="dxa"/>
-              <w:left w:w="120" w:type="dxa"/>
-              <w:right w:w="120" w:type="dxa"/>
+              <w:top w:w="60" w:type="dxa"/>
+              <w:bottom w:w="60" w:type="dxa"/>
+              <w:left w:w="100" w:type="dxa"/>
+              <w:right w:w="100" w:type="dxa"/>
             </w:tcMar>
           </w:tcPr>
           <w:p>
@@ -362,7 +362,7 @@
             </w:pPr>
             <w:r>
               <w:rPr>
-                <w:color w:val="4A5568"/>
+                <w:color w:val="475569"/>
                 <w:sz w:val="17"/>
               </w:rPr>
               <w:t>Embedded Human-Machine Interfaces (HMI), Wireless Gaming Controllers, Precision Robotics</w:t>
@@ -373,26 +373,26 @@
     </w:tbl>
     <w:p>
       <w:pPr>
-        <w:spacing w:after="240"/>
+        <w:spacing w:after="200"/>
       </w:pPr>
     </w:p>
     <w:p>
       <w:pPr>
         <w:keepNext/>
-        <w:spacing w:before="280" w:after="80"/>
+        <w:spacing w:before="240" w:after="60"/>
       </w:pPr>
       <w:r>
         <w:rPr>
           <w:b/>
-          <w:color w:val="1B365D"/>
-          <w:sz w:val="23"/>
+          <w:color w:val="0F172A"/>
+          <w:sz w:val="21"/>
         </w:rPr>
         <w:t>1. ABSTRACT OF THE INVENTION</w:t>
       </w:r>
     </w:p>
     <w:p>
       <w:pPr>
-        <w:spacing w:line="276" w:lineRule="auto" w:after="160"/>
+        <w:spacing w:line="276" w:lineRule="auto" w:after="120"/>
       </w:pPr>
       <w:r>
         <w:t>An embedded interactive signal conditioning apparatus and deterministic telemetry architecture are disclosed that eliminate mechanical snapback overshoots on spring-biased analog potentiometric transducers while providing sub-2 millisecond physical RF airtime telemetry. The apparatus comprises a dual-axis spring-centered resistive transducer, an analog-to-digital converter (ADC), a graphic display coupled via a serial peripheral interface (SPI) bus, an RF transceiver, and a processing unit. The processing unit estimates real-time finite-difference kinematic displacement velocities of the transducer. Upon detecting a rapid return trajectory toward the neutral axis followed by an axis sign reversal into the opposing quadrant, an asymmetric directional damping filter suppresses opposing recoil to neutral center during a calibrated temporal window (20–50 ms) while preserving instantaneous zero-lag passthrough for operator-directed outward inputs. Conditioned coordinate matrices are serialized into fixed-length action frames and broadcast over an unassociated 802.11 channel with automated baseband channel-lock recovery, while display scanlines are composited using dual line buffers (640 bytes total) to free system RAM for concurrent RF baseband operations.</w:t>
@@ -401,13 +401,13 @@
     <w:p>
       <w:pPr>
         <w:keepNext/>
-        <w:spacing w:before="280" w:after="80"/>
+        <w:spacing w:before="240" w:after="60"/>
       </w:pPr>
       <w:r>
         <w:rPr>
           <w:b/>
-          <w:color w:val="1B365D"/>
-          <w:sz w:val="23"/>
+          <w:color w:val="0F172A"/>
+          <w:sz w:val="21"/>
         </w:rPr>
         <w:t>2. BACKGROUND OF THE INVENTION &amp; PRIOR ART DEFICIENCIES</w:t>
       </w:r>
@@ -415,13 +415,13 @@
     <w:p>
       <w:pPr>
         <w:keepNext/>
-        <w:spacing w:before="200" w:after="60"/>
+        <w:spacing w:before="160" w:after="40"/>
       </w:pPr>
       <w:r>
         <w:rPr>
           <w:b/>
-          <w:color w:val="2B6CB0"/>
-          <w:sz w:val="20"/>
+          <w:color w:val="2563EB"/>
+          <w:sz w:val="19"/>
         </w:rPr>
         <w:t>2.1 The Technical Problem: Mechanical Transducer Snapback</w:t>
       </w:r>
@@ -434,13 +434,13 @@
     <w:p>
       <w:pPr>
         <w:keepNext/>
-        <w:spacing w:before="200" w:after="60"/>
+        <w:spacing w:before="160" w:after="40"/>
       </w:pPr>
       <w:r>
         <w:rPr>
           <w:b/>
-          <w:color w:val="2B6CB0"/>
-          <w:sz w:val="20"/>
+          <w:color w:val="2563EB"/>
+          <w:sz w:val="19"/>
         </w:rPr>
         <w:t>2.2 Deficiencies in Existing Solutions</w:t>
       </w:r>
@@ -457,13 +457,13 @@
     <w:p>
       <w:pPr>
         <w:keepNext/>
-        <w:spacing w:before="200" w:after="60"/>
+        <w:spacing w:before="160" w:after="40"/>
       </w:pPr>
       <w:r>
         <w:rPr>
           <w:b/>
-          <w:color w:val="2B6CB0"/>
-          <w:sz w:val="20"/>
+          <w:color w:val="2563EB"/>
+          <w:sz w:val="19"/>
         </w:rPr>
         <w:t>2.3 The Wireless Telemetry &amp; Memory Coexistence Problem</w:t>
       </w:r>
@@ -476,13 +476,13 @@
     <w:p>
       <w:pPr>
         <w:keepNext/>
-        <w:spacing w:before="280" w:after="80"/>
+        <w:spacing w:before="240" w:after="60"/>
       </w:pPr>
       <w:r>
         <w:rPr>
           <w:b/>
-          <w:color w:val="1B365D"/>
-          <w:sz w:val="23"/>
+          <w:color w:val="0F172A"/>
+          <w:sz w:val="21"/>
         </w:rPr>
         <w:t>3. DETAILED DESCRIPTION OF THE PREFERRED EMBODIMENTS</w:t>
       </w:r>
@@ -507,13 +507,13 @@
     <w:p>
       <w:pPr>
         <w:keepNext/>
-        <w:spacing w:before="280" w:after="80"/>
+        <w:spacing w:before="240" w:after="60"/>
       </w:pPr>
       <w:r>
         <w:rPr>
           <w:b/>
-          <w:color w:val="1B365D"/>
-          <w:sz w:val="23"/>
+          <w:color w:val="0F172A"/>
+          <w:sz w:val="21"/>
         </w:rPr>
         <w:t>4. EXPERIMENTAL VERIFICATION &amp; TEST DATA</w:t>
       </w:r>
@@ -538,13 +538,13 @@
     <w:p>
       <w:pPr>
         <w:keepNext/>
-        <w:spacing w:before="280" w:after="80"/>
+        <w:spacing w:before="240" w:after="60"/>
       </w:pPr>
       <w:r>
         <w:rPr>
           <w:b/>
-          <w:color w:val="1B365D"/>
-          <w:sz w:val="23"/>
+          <w:color w:val="0F172A"/>
+          <w:sz w:val="21"/>
         </w:rPr>
         <w:t>5. COMPLETE PATENT CLAIMS SET</w:t>
       </w:r>
@@ -553,20 +553,20 @@
       <w:r>
         <w:rPr>
           <w:b/>
-          <w:sz w:val="21"/>
+          <w:sz w:val="20"/>
         </w:rPr>
         <w:t>WE CLAIM:</w:t>
       </w:r>
     </w:p>
     <w:p>
       <w:pPr>
-        <w:spacing w:after="80"/>
-        <w:ind w:left="432" w:hanging="432"/>
+        <w:spacing w:after="60"/>
+        <w:ind w:left="360" w:hanging="360"/>
       </w:pPr>
       <w:r>
         <w:rPr>
           <w:b/>
-          <w:color w:val="1B365D"/>
+          <w:color w:val="0F172A"/>
         </w:rPr>
         <w:t xml:space="preserve">1. </w:t>
       </w:r>
@@ -592,13 +592,13 @@
     </w:p>
     <w:p>
       <w:pPr>
-        <w:spacing w:after="80"/>
-        <w:ind w:left="432" w:hanging="432"/>
+        <w:spacing w:after="60"/>
+        <w:ind w:left="360" w:hanging="360"/>
       </w:pPr>
       <w:r>
         <w:rPr>
           <w:b/>
-          <w:color w:val="1B365D"/>
+          <w:color w:val="0F172A"/>
         </w:rPr>
         <w:t xml:space="preserve">2. </w:t>
       </w:r>
@@ -608,13 +608,13 @@
     </w:p>
     <w:p>
       <w:pPr>
-        <w:spacing w:after="80"/>
-        <w:ind w:left="432" w:hanging="432"/>
+        <w:spacing w:after="60"/>
+        <w:ind w:left="360" w:hanging="360"/>
       </w:pPr>
       <w:r>
         <w:rPr>
           <w:b/>
-          <w:color w:val="1B365D"/>
+          <w:color w:val="0F172A"/>
         </w:rPr>
         <w:t xml:space="preserve">3. </w:t>
       </w:r>
@@ -624,13 +624,13 @@
     </w:p>
     <w:p>
       <w:pPr>
-        <w:spacing w:after="80"/>
-        <w:ind w:left="432" w:hanging="432"/>
+        <w:spacing w:after="60"/>
+        <w:ind w:left="360" w:hanging="360"/>
       </w:pPr>
       <w:r>
         <w:rPr>
           <w:b/>
-          <w:color w:val="1B365D"/>
+          <w:color w:val="0F172A"/>
         </w:rPr>
         <w:t xml:space="preserve">4. </w:t>
       </w:r>
@@ -640,13 +640,13 @@
     </w:p>
     <w:p>
       <w:pPr>
-        <w:spacing w:after="80"/>
-        <w:ind w:left="432" w:hanging="432"/>
+        <w:spacing w:after="60"/>
+        <w:ind w:left="360" w:hanging="360"/>
       </w:pPr>
       <w:r>
         <w:rPr>
           <w:b/>
-          <w:color w:val="1B365D"/>
+          <w:color w:val="0F172A"/>
         </w:rPr>
         <w:t xml:space="preserve">5. </w:t>
       </w:r>
@@ -666,13 +666,13 @@
     </w:p>
     <w:p>
       <w:pPr>
-        <w:spacing w:after="80"/>
-        <w:ind w:left="432" w:hanging="432"/>
+        <w:spacing w:after="60"/>
+        <w:ind w:left="360" w:hanging="360"/>
       </w:pPr>
       <w:r>
         <w:rPr>
           <w:b/>
-          <w:color w:val="1B365D"/>
+          <w:color w:val="0F172A"/>
         </w:rPr>
         <w:t xml:space="preserve">6. </w:t>
       </w:r>
@@ -682,13 +682,13 @@
     </w:p>
     <w:p>
       <w:pPr>
-        <w:spacing w:after="80"/>
-        <w:ind w:left="432" w:hanging="432"/>
+        <w:spacing w:after="60"/>
+        <w:ind w:left="360" w:hanging="360"/>
       </w:pPr>
       <w:r>
         <w:rPr>
           <w:b/>
-          <w:color w:val="1B365D"/>
+          <w:color w:val="0F172A"/>
         </w:rPr>
         <w:t xml:space="preserve">7. </w:t>
       </w:r>
@@ -698,13 +698,13 @@
     </w:p>
     <w:p>
       <w:pPr>
-        <w:spacing w:after="80"/>
-        <w:ind w:left="432" w:hanging="432"/>
+        <w:spacing w:after="60"/>
+        <w:ind w:left="360" w:hanging="360"/>
       </w:pPr>
       <w:r>
         <w:rPr>
           <w:b/>
-          <w:color w:val="1B365D"/>
+          <w:color w:val="0F172A"/>
         </w:rPr>
         <w:t xml:space="preserve">8. </w:t>
       </w:r>
@@ -714,13 +714,13 @@
     </w:p>
     <w:p>
       <w:pPr>
-        <w:spacing w:after="80"/>
-        <w:ind w:left="432" w:hanging="432"/>
+        <w:spacing w:after="60"/>
+        <w:ind w:left="360" w:hanging="360"/>
       </w:pPr>
       <w:r>
         <w:rPr>
           <w:b/>
-          <w:color w:val="1B365D"/>
+          <w:color w:val="0F172A"/>
         </w:rPr>
         <w:t xml:space="preserve">9. </w:t>
       </w:r>
@@ -730,13 +730,13 @@
     </w:p>
     <w:p>
       <w:pPr>
-        <w:spacing w:after="80"/>
-        <w:ind w:left="432" w:hanging="432"/>
+        <w:spacing w:after="60"/>
+        <w:ind w:left="360" w:hanging="360"/>
       </w:pPr>
       <w:r>
         <w:rPr>
           <w:b/>
-          <w:color w:val="1B365D"/>
+          <w:color w:val="0F172A"/>
         </w:rPr>
         <w:t xml:space="preserve">10. </w:t>
       </w:r>
@@ -757,13 +757,13 @@
     <w:p>
       <w:pPr>
         <w:keepNext/>
-        <w:spacing w:before="280" w:after="80"/>
+        <w:spacing w:before="240" w:after="60"/>
       </w:pPr>
       <w:r>
         <w:rPr>
           <w:b/>
-          <w:color w:val="1B365D"/>
-          <w:sz w:val="23"/>
+          <w:color w:val="0F172A"/>
+          <w:sz w:val="21"/>
         </w:rPr>
         <w:t>6. LIST OF FIGURES &amp; ENGINEERING DRAWINGS</w:t>
       </w:r>
@@ -776,13 +776,13 @@
     <w:p>
       <w:pPr>
         <w:keepNext/>
-        <w:spacing w:before="160" w:after="80"/>
+        <w:spacing w:before="120" w:after="60"/>
         <w:jc w:val="center"/>
       </w:pPr>
       <w:r>
         <w:drawing>
           <wp:inline xmlns:a="http://schemas.openxmlformats.org/drawingml/2006/main" xmlns:pic="http://schemas.openxmlformats.org/drawingml/2006/picture">
-            <wp:extent cx="5669280" cy="3653536"/>
+            <wp:extent cx="6217920" cy="3997234"/>
             <wp:docPr id="1" name="Picture 1"/>
             <wp:cNvGraphicFramePr>
               <a:graphicFrameLocks noChangeAspect="1"/>
@@ -803,7 +803,7 @@
                   <pic:spPr>
                     <a:xfrm>
                       <a:off x="0" y="0"/>
-                      <a:ext cx="5669280" cy="3653536"/>
+                      <a:ext cx="6217920" cy="3997234"/>
                     </a:xfrm>
                     <a:prstGeom prst="rect"/>
                   </pic:spPr>
@@ -816,22 +816,22 @@
     </w:p>
     <w:p>
       <w:pPr>
-        <w:spacing w:before="40" w:after="280"/>
+        <w:spacing w:before="40" w:after="240"/>
         <w:jc w:val="center"/>
       </w:pPr>
       <w:r>
         <w:rPr>
           <w:b/>
-          <w:color w:val="1B365D"/>
-          <w:sz w:val="19"/>
+          <w:color w:val="0F172A"/>
+          <w:sz w:val="17"/>
         </w:rPr>
         <w:t xml:space="preserve">Figure 1: </w:t>
       </w:r>
       <w:r>
         <w:rPr>
           <w:b/>
-          <w:color w:val="2D3748"/>
-          <w:sz w:val="19"/>
+          <w:color w:val="334155"/>
+          <w:sz w:val="17"/>
         </w:rPr>
         <w:t>Architectural Signal Flow &amp; Algorithmic State Machine</w:t>
       </w:r>
@@ -841,8 +841,8 @@
       <w:r>
         <w:rPr>
           <w:i/>
-          <w:color w:val="718096"/>
-          <w:sz w:val="17"/>
+          <w:color w:val="64748B"/>
+          <w:sz w:val="15"/>
         </w:rPr>
         <w:t>Complete technical block diagram illustrating the physical transducer domain [100, 102], finite-difference derivative estimator [104], deflection latch [106], velocity gating [108], axis sign reversal detector [110], asymmetric suppression clamp [112], and downstream dual-line display [114] and 60 Hz ad-hoc RF telemetry [116].</w:t>
       </w:r>
@@ -853,34 +853,34 @@
         <w:jc w:val="center"/>
         <w:tblLook w:firstColumn="1" w:firstRow="1" w:lastColumn="0" w:lastRow="0" w:noHBand="0" w:noVBand="1" w:val="04A0"/>
         <w:tblBorders>
-          <w:top w:val="single" w:sz="4" w:space="0" w:color="E2E8F0"/>
-          <w:bottom w:val="single" w:sz="4" w:space="0" w:color="E2E8F0"/>
-          <w:left w:val="single" w:sz="4" w:space="0" w:color="E2E8F0"/>
-          <w:right w:val="single" w:sz="4" w:space="0" w:color="E2E8F0"/>
-          <w:insideH w:val="single" w:sz="4" w:space="0" w:color="E2E8F0"/>
-          <w:insideV w:val="single" w:sz="4" w:space="0" w:color="E2E8F0"/>
+          <w:top w:val="none"/>
+          <w:bottom w:val="none"/>
+          <w:left w:val="none"/>
+          <w:right w:val="none"/>
+          <w:insideH w:val="none"/>
+          <w:insideV w:val="none"/>
         </w:tblBorders>
       </w:tblPr>
       <w:tblGrid>
-        <w:gridCol w:w="4680"/>
-        <w:gridCol w:w="4680"/>
+        <w:gridCol w:w="5040"/>
+        <w:gridCol w:w="5040"/>
       </w:tblGrid>
       <w:tr>
         <w:tc>
           <w:tcPr>
-            <w:tcW w:type="dxa" w:w="4464"/>
+            <w:tcW w:type="dxa" w:w="4968"/>
             <w:shd w:fill="FFFFFF"/>
             <w:tcMar>
-              <w:top w:w="80" w:type="dxa"/>
-              <w:bottom w:w="100" w:type="dxa"/>
-              <w:left w:w="80" w:type="dxa"/>
-              <w:right w:w="80" w:type="dxa"/>
+              <w:top w:w="40" w:type="dxa"/>
+              <w:bottom w:w="60" w:type="dxa"/>
+              <w:left w:w="40" w:type="dxa"/>
+              <w:right w:w="40" w:type="dxa"/>
             </w:tcMar>
           </w:tcPr>
           <w:p>
             <w:pPr>
               <w:keepNext/>
-              <w:spacing w:before="80" w:after="80"/>
+              <w:spacing w:before="40" w:after="40"/>
               <w:jc w:val="center"/>
             </w:pPr>
             <w:r>
@@ -926,16 +926,16 @@
             <w:r>
               <w:rPr>
                 <w:b/>
-                <w:color w:val="1B365D"/>
-                <w:sz w:val="17"/>
+                <w:color w:val="0F172A"/>
+                <w:sz w:val="16"/>
               </w:rPr>
               <w:t xml:space="preserve">Figure 2: </w:t>
             </w:r>
             <w:r>
               <w:rPr>
                 <w:b/>
-                <w:color w:val="2D3748"/>
-                <w:sz w:val="17"/>
+                <w:color w:val="334155"/>
+                <w:sz w:val="16"/>
               </w:rPr>
               <w:t>Physical Hardware Prototype</w:t>
             </w:r>
@@ -945,8 +945,8 @@
             <w:r>
               <w:rPr>
                 <w:i/>
-                <w:color w:val="718096"/>
-                <w:sz w:val="15"/>
+                <w:color w:val="64748B"/>
+                <w:sz w:val="14"/>
               </w:rPr>
               <w:t>Assembled handheld controller showing 1.8-inch ST7735 color TFT display, dual-axis potentiometric thumbstick gimbal, tactile switch array, and status LEDs.</w:t>
             </w:r>
@@ -954,19 +954,19 @@
         </w:tc>
         <w:tc>
           <w:tcPr>
-            <w:tcW w:type="dxa" w:w="4464"/>
+            <w:tcW w:type="dxa" w:w="4968"/>
             <w:shd w:fill="FFFFFF"/>
             <w:tcMar>
-              <w:top w:w="80" w:type="dxa"/>
-              <w:bottom w:w="100" w:type="dxa"/>
-              <w:left w:w="80" w:type="dxa"/>
-              <w:right w:w="80" w:type="dxa"/>
+              <w:top w:w="40" w:type="dxa"/>
+              <w:bottom w:w="60" w:type="dxa"/>
+              <w:left w:w="40" w:type="dxa"/>
+              <w:right w:w="40" w:type="dxa"/>
             </w:tcMar>
           </w:tcPr>
           <w:p>
             <w:pPr>
               <w:keepNext/>
-              <w:spacing w:before="80" w:after="80"/>
+              <w:spacing w:before="40" w:after="40"/>
               <w:jc w:val="center"/>
             </w:pPr>
             <w:r>
@@ -1012,16 +1012,16 @@
             <w:r>
               <w:rPr>
                 <w:b/>
-                <w:color w:val="1B365D"/>
-                <w:sz w:val="17"/>
+                <w:color w:val="0F172A"/>
+                <w:sz w:val="16"/>
               </w:rPr>
               <w:t xml:space="preserve">Figure 3: </w:t>
             </w:r>
             <w:r>
               <w:rPr>
                 <w:b/>
-                <w:color w:val="2D3748"/>
-                <w:sz w:val="17"/>
+                <w:color w:val="334155"/>
+                <w:sz w:val="16"/>
               </w:rPr>
               <w:t>Rear Circuit Wiring</w:t>
             </w:r>
@@ -1031,8 +1031,8 @@
             <w:r>
               <w:rPr>
                 <w:i/>
-                <w:color w:val="718096"/>
-                <w:sz w:val="15"/>
+                <w:color w:val="64748B"/>
+                <w:sz w:val="14"/>
               </w:rPr>
               <w:t>Hand-wired point-to-point architecture displaying 240 MHz ESP32 host module, 27 MHz SPI display bus lines, SAR ADC input lines, and power decoupling.</w:t>
             </w:r>
@@ -1042,7 +1042,7 @@
     </w:tbl>
     <w:p>
       <w:pPr>
-        <w:spacing w:after="120"/>
+        <w:spacing w:after="80"/>
       </w:pPr>
     </w:p>
     <w:tbl>
@@ -1051,34 +1051,34 @@
         <w:jc w:val="center"/>
         <w:tblLook w:firstColumn="1" w:firstRow="1" w:lastColumn="0" w:lastRow="0" w:noHBand="0" w:noVBand="1" w:val="04A0"/>
         <w:tblBorders>
-          <w:top w:val="single" w:sz="4" w:space="0" w:color="E2E8F0"/>
-          <w:bottom w:val="single" w:sz="4" w:space="0" w:color="E2E8F0"/>
-          <w:left w:val="single" w:sz="4" w:space="0" w:color="E2E8F0"/>
-          <w:right w:val="single" w:sz="4" w:space="0" w:color="E2E8F0"/>
-          <w:insideH w:val="single" w:sz="4" w:space="0" w:color="E2E8F0"/>
-          <w:insideV w:val="single" w:sz="4" w:space="0" w:color="E2E8F0"/>
+          <w:top w:val="none"/>
+          <w:bottom w:val="none"/>
+          <w:left w:val="none"/>
+          <w:right w:val="none"/>
+          <w:insideH w:val="none"/>
+          <w:insideV w:val="none"/>
         </w:tblBorders>
       </w:tblPr>
       <w:tblGrid>
-        <w:gridCol w:w="4680"/>
-        <w:gridCol w:w="4680"/>
+        <w:gridCol w:w="5040"/>
+        <w:gridCol w:w="5040"/>
       </w:tblGrid>
       <w:tr>
         <w:tc>
           <w:tcPr>
-            <w:tcW w:type="dxa" w:w="4464"/>
+            <w:tcW w:type="dxa" w:w="4968"/>
             <w:shd w:fill="FFFFFF"/>
             <w:tcMar>
-              <w:top w:w="80" w:type="dxa"/>
-              <w:bottom w:w="100" w:type="dxa"/>
-              <w:left w:w="80" w:type="dxa"/>
-              <w:right w:w="80" w:type="dxa"/>
+              <w:top w:w="40" w:type="dxa"/>
+              <w:bottom w:w="60" w:type="dxa"/>
+              <w:left w:w="40" w:type="dxa"/>
+              <w:right w:w="40" w:type="dxa"/>
             </w:tcMar>
           </w:tcPr>
           <w:p>
             <w:pPr>
               <w:keepNext/>
-              <w:spacing w:before="80" w:after="80"/>
+              <w:spacing w:before="40" w:after="40"/>
               <w:jc w:val="center"/>
             </w:pPr>
             <w:r>
@@ -1124,16 +1124,16 @@
             <w:r>
               <w:rPr>
                 <w:b/>
-                <w:color w:val="1B365D"/>
-                <w:sz w:val="17"/>
+                <w:color w:val="0F172A"/>
+                <w:sz w:val="16"/>
               </w:rPr>
               <w:t xml:space="preserve">Figure 4: </w:t>
             </w:r>
             <w:r>
               <w:rPr>
                 <w:b/>
-                <w:color w:val="2D3748"/>
-                <w:sz w:val="17"/>
+                <w:color w:val="334155"/>
+                <w:sz w:val="16"/>
               </w:rPr>
               <w:t>Smart Snapback Visual Radar</w:t>
             </w:r>
@@ -1143,8 +1143,8 @@
             <w:r>
               <w:rPr>
                 <w:i/>
-                <w:color w:val="718096"/>
-                <w:sz w:val="15"/>
+                <w:color w:val="64748B"/>
+                <w:sz w:val="14"/>
               </w:rPr>
               <w:t>Diagnostic telemetry screen displaying real-time deflection velocity estimation, origin latching, and active 50ms directional recoil damping.</w:t>
             </w:r>
@@ -1152,19 +1152,19 @@
         </w:tc>
         <w:tc>
           <w:tcPr>
-            <w:tcW w:type="dxa" w:w="4464"/>
+            <w:tcW w:type="dxa" w:w="4968"/>
             <w:shd w:fill="FFFFFF"/>
             <w:tcMar>
-              <w:top w:w="80" w:type="dxa"/>
-              <w:bottom w:w="100" w:type="dxa"/>
-              <w:left w:w="80" w:type="dxa"/>
-              <w:right w:w="80" w:type="dxa"/>
+              <w:top w:w="40" w:type="dxa"/>
+              <w:bottom w:w="60" w:type="dxa"/>
+              <w:left w:w="40" w:type="dxa"/>
+              <w:right w:w="40" w:type="dxa"/>
             </w:tcMar>
           </w:tcPr>
           <w:p>
             <w:pPr>
               <w:keepNext/>
-              <w:spacing w:before="80" w:after="80"/>
+              <w:spacing w:before="40" w:after="40"/>
               <w:jc w:val="center"/>
             </w:pPr>
             <w:r>
@@ -1210,16 +1210,16 @@
             <w:r>
               <w:rPr>
                 <w:b/>
-                <w:color w:val="1B365D"/>
-                <w:sz w:val="17"/>
+                <w:color w:val="0F172A"/>
+                <w:sz w:val="16"/>
               </w:rPr>
               <w:t xml:space="preserve">Figure 5: </w:t>
             </w:r>
             <w:r>
               <w:rPr>
                 <w:b/>
-                <w:color w:val="2D3748"/>
-                <w:sz w:val="17"/>
+                <w:color w:val="334155"/>
+                <w:sz w:val="16"/>
               </w:rPr>
               <w:t>System Memory Telemetry</w:t>
             </w:r>
@@ -1229,8 +1229,8 @@
             <w:r>
               <w:rPr>
                 <w:i/>
-                <w:color w:val="718096"/>
-                <w:sz w:val="15"/>
+                <w:color w:val="64748B"/>
+                <w:sz w:val="14"/>
               </w:rPr>
               <w:t>On-screen diagnostic telemetry demonstrating 640-byte line-buffer footprint (0.6 KB) vs 41 KB full framebuffer, verifying 98.4% RAM savings.</w:t>
             </w:r>
@@ -1240,7 +1240,7 @@
     </w:tbl>
     <w:p>
       <w:pPr>
-        <w:spacing w:after="120"/>
+        <w:spacing w:after="80"/>
       </w:pPr>
     </w:p>
     <w:tbl>
@@ -1249,34 +1249,34 @@
         <w:jc w:val="center"/>
         <w:tblLook w:firstColumn="1" w:firstRow="1" w:lastColumn="0" w:lastRow="0" w:noHBand="0" w:noVBand="1" w:val="04A0"/>
         <w:tblBorders>
-          <w:top w:val="single" w:sz="4" w:space="0" w:color="E2E8F0"/>
-          <w:bottom w:val="single" w:sz="4" w:space="0" w:color="E2E8F0"/>
-          <w:left w:val="single" w:sz="4" w:space="0" w:color="E2E8F0"/>
-          <w:right w:val="single" w:sz="4" w:space="0" w:color="E2E8F0"/>
-          <w:insideH w:val="single" w:sz="4" w:space="0" w:color="E2E8F0"/>
-          <w:insideV w:val="single" w:sz="4" w:space="0" w:color="E2E8F0"/>
+          <w:top w:val="none"/>
+          <w:bottom w:val="none"/>
+          <w:left w:val="none"/>
+          <w:right w:val="none"/>
+          <w:insideH w:val="none"/>
+          <w:insideV w:val="none"/>
         </w:tblBorders>
       </w:tblPr>
       <w:tblGrid>
-        <w:gridCol w:w="4680"/>
-        <w:gridCol w:w="4680"/>
+        <w:gridCol w:w="5040"/>
+        <w:gridCol w:w="5040"/>
       </w:tblGrid>
       <w:tr>
         <w:tc>
           <w:tcPr>
-            <w:tcW w:type="dxa" w:w="4464"/>
+            <w:tcW w:type="dxa" w:w="4968"/>
             <w:shd w:fill="FFFFFF"/>
             <w:tcMar>
-              <w:top w:w="80" w:type="dxa"/>
-              <w:bottom w:w="100" w:type="dxa"/>
-              <w:left w:w="80" w:type="dxa"/>
-              <w:right w:w="80" w:type="dxa"/>
+              <w:top w:w="40" w:type="dxa"/>
+              <w:bottom w:w="60" w:type="dxa"/>
+              <w:left w:w="40" w:type="dxa"/>
+              <w:right w:w="40" w:type="dxa"/>
             </w:tcMar>
           </w:tcPr>
           <w:p>
             <w:pPr>
               <w:keepNext/>
-              <w:spacing w:before="80" w:after="80"/>
+              <w:spacing w:before="40" w:after="40"/>
               <w:jc w:val="center"/>
             </w:pPr>
             <w:r>
@@ -1322,16 +1322,16 @@
             <w:r>
               <w:rPr>
                 <w:b/>
-                <w:color w:val="1B365D"/>
-                <w:sz w:val="17"/>
+                <w:color w:val="0F172A"/>
+                <w:sz w:val="16"/>
               </w:rPr>
               <w:t xml:space="preserve">Figure 6: </w:t>
             </w:r>
             <w:r>
               <w:rPr>
                 <w:b/>
-                <w:color w:val="2D3748"/>
-                <w:sz w:val="17"/>
+                <w:color w:val="334155"/>
+                <w:sz w:val="16"/>
               </w:rPr>
               <w:t>Station Wi-Fi Scanner</w:t>
             </w:r>
@@ -1341,8 +1341,8 @@
             <w:r>
               <w:rPr>
                 <w:i/>
-                <w:color w:val="718096"/>
-                <w:sz w:val="15"/>
+                <w:color w:val="64748B"/>
+                <w:sz w:val="14"/>
               </w:rPr>
               <w:t>Diagnostic interface scanning 2.4 GHz infrastructure networks to obtain cloud binary connectivity prior to automated Channel 1 radio re-locking.</w:t>
             </w:r>
@@ -1350,19 +1350,19 @@
         </w:tc>
         <w:tc>
           <w:tcPr>
-            <w:tcW w:type="dxa" w:w="4464"/>
+            <w:tcW w:type="dxa" w:w="4968"/>
             <w:shd w:fill="FFFFFF"/>
             <w:tcMar>
-              <w:top w:w="80" w:type="dxa"/>
-              <w:bottom w:w="100" w:type="dxa"/>
-              <w:left w:w="80" w:type="dxa"/>
-              <w:right w:w="80" w:type="dxa"/>
+              <w:top w:w="40" w:type="dxa"/>
+              <w:bottom w:w="60" w:type="dxa"/>
+              <w:left w:w="40" w:type="dxa"/>
+              <w:right w:w="40" w:type="dxa"/>
             </w:tcMar>
           </w:tcPr>
           <w:p>
             <w:pPr>
               <w:keepNext/>
-              <w:spacing w:before="80" w:after="80"/>
+              <w:spacing w:before="40" w:after="40"/>
               <w:jc w:val="center"/>
             </w:pPr>
             <w:r>
@@ -1408,16 +1408,16 @@
             <w:r>
               <w:rPr>
                 <w:b/>
-                <w:color w:val="1B365D"/>
-                <w:sz w:val="17"/>
+                <w:color w:val="0F172A"/>
+                <w:sz w:val="16"/>
               </w:rPr>
               <w:t xml:space="preserve">Figure 7: </w:t>
             </w:r>
             <w:r>
               <w:rPr>
                 <w:b/>
-                <w:color w:val="2D3748"/>
-                <w:sz w:val="17"/>
+                <w:color w:val="334155"/>
+                <w:sz w:val="16"/>
               </w:rPr>
               <w:t>Cloud OTA Update Suite</w:t>
             </w:r>
@@ -1427,8 +1427,8 @@
             <w:r>
               <w:rPr>
                 <w:i/>
-                <w:color w:val="718096"/>
-                <w:sz w:val="15"/>
+                <w:color w:val="64748B"/>
+                <w:sz w:val="14"/>
               </w:rPr>
               <w:t>(Left) Automated GitHub Release version detection dialog. (Right) Live byte-count partition flashing progress stream without host PC.</w:t>
             </w:r>
@@ -1438,19 +1438,19 @@
     </w:tbl>
     <w:p>
       <w:pPr>
-        <w:spacing w:after="120"/>
+        <w:spacing w:after="80"/>
       </w:pPr>
     </w:p>
     <w:p>
       <w:pPr>
         <w:keepNext/>
-        <w:spacing w:before="160" w:after="80"/>
+        <w:spacing w:before="120" w:after="40"/>
         <w:jc w:val="center"/>
       </w:pPr>
       <w:r>
         <w:drawing>
           <wp:inline xmlns:a="http://schemas.openxmlformats.org/drawingml/2006/main" xmlns:pic="http://schemas.openxmlformats.org/drawingml/2006/picture">
-            <wp:extent cx="5669280" cy="2521648"/>
+            <wp:extent cx="6217920" cy="2765679"/>
             <wp:docPr id="8" name="Picture 8"/>
             <wp:cNvGraphicFramePr>
               <a:graphicFrameLocks noChangeAspect="1"/>
@@ -1471,7 +1471,7 @@
                   <pic:spPr>
                     <a:xfrm>
                       <a:off x="0" y="0"/>
-                      <a:ext cx="5669280" cy="2521648"/>
+                      <a:ext cx="6217920" cy="2765679"/>
                     </a:xfrm>
                     <a:prstGeom prst="rect"/>
                   </pic:spPr>
@@ -1484,22 +1484,22 @@
     </w:p>
     <w:p>
       <w:pPr>
-        <w:spacing w:before="40" w:after="280"/>
+        <w:spacing w:before="40" w:after="200"/>
         <w:jc w:val="center"/>
       </w:pPr>
       <w:r>
         <w:rPr>
           <w:b/>
-          <w:color w:val="1B365D"/>
-          <w:sz w:val="19"/>
+          <w:color w:val="0F172A"/>
+          <w:sz w:val="17"/>
         </w:rPr>
         <w:t xml:space="preserve">Figure 8: </w:t>
       </w:r>
       <w:r>
         <w:rPr>
           <w:b/>
-          <w:color w:val="2D3748"/>
-          <w:sz w:val="19"/>
+          <w:color w:val="334155"/>
+          <w:sz w:val="17"/>
         </w:rPr>
         <w:t>Live Hardware Rebound Suppression Multi-Frame Demonstration</w:t>
       </w:r>
@@ -1509,8 +1509,8 @@
       <w:r>
         <w:rPr>
           <w:i/>
-          <w:color w:val="718096"/>
-          <w:sz w:val="17"/>
+          <w:color w:val="64748B"/>
+          <w:sz w:val="15"/>
         </w:rPr>
         <w:t>Consecutive multi-frame photographic filmstrip showing rapid mechanical thumbstick flick tests on the operational handheld console. The visual radar confirms real-time velocity tracking and immediate coordinate clamping to the neutral deadzone without false reverse actuations.</w:t>
       </w:r>
@@ -1518,13 +1518,13 @@
     <w:p>
       <w:pPr>
         <w:keepNext/>
-        <w:spacing w:before="160" w:after="80"/>
+        <w:spacing w:before="120" w:after="40"/>
         <w:jc w:val="center"/>
       </w:pPr>
       <w:r>
         <w:drawing>
           <wp:inline xmlns:a="http://schemas.openxmlformats.org/drawingml/2006/main" xmlns:pic="http://schemas.openxmlformats.org/drawingml/2006/picture">
-            <wp:extent cx="5669280" cy="2462594"/>
+            <wp:extent cx="6217920" cy="2700909"/>
             <wp:docPr id="9" name="Picture 9"/>
             <wp:cNvGraphicFramePr>
               <a:graphicFrameLocks noChangeAspect="1"/>
@@ -1545,7 +1545,7 @@
                   <pic:spPr>
                     <a:xfrm>
                       <a:off x="0" y="0"/>
-                      <a:ext cx="5669280" cy="2462594"/>
+                      <a:ext cx="6217920" cy="2700909"/>
                     </a:xfrm>
                     <a:prstGeom prst="rect"/>
                   </pic:spPr>
@@ -1558,22 +1558,22 @@
     </w:p>
     <w:p>
       <w:pPr>
-        <w:spacing w:before="40" w:after="280"/>
+        <w:spacing w:before="40" w:after="200"/>
         <w:jc w:val="center"/>
       </w:pPr>
       <w:r>
         <w:rPr>
           <w:b/>
-          <w:color w:val="1B365D"/>
-          <w:sz w:val="19"/>
+          <w:color w:val="0F172A"/>
+          <w:sz w:val="17"/>
         </w:rPr>
         <w:t xml:space="preserve">Figure 9: </w:t>
       </w:r>
       <w:r>
         <w:rPr>
           <w:b/>
-          <w:color w:val="2D3748"/>
-          <w:sz w:val="19"/>
+          <w:color w:val="334155"/>
+          <w:sz w:val="17"/>
         </w:rPr>
         <w:t>Live Peer-to-Peer Telemetry &amp; Two-Node Operational Demonstration</w:t>
       </w:r>
@@ -1583,8 +1583,8 @@
       <w:r>
         <w:rPr>
           <w:i/>
-          <w:color w:val="718096"/>
-          <w:sz w:val="17"/>
+          <w:color w:val="64748B"/>
+          <w:sz w:val="15"/>
         </w:rPr>
         <w:t>Sequential multi-frame photographic filmstrip capturing active peer-to-peer multiplayer Pong gameplay between the primary handheld apparatus (bottom) and secondary companion node (top right). Real-time 60 Hz coordinate and state synchronization confirms uninterrupted low-latency RF telemetry over dedicated Channel 1 without network drops.</w:t>
       </w:r>
@@ -1592,20 +1592,20 @@
     <w:p>
       <w:pPr>
         <w:keepNext/>
-        <w:spacing w:before="280" w:after="80"/>
+        <w:spacing w:before="240" w:after="60"/>
       </w:pPr>
       <w:r>
         <w:rPr>
           <w:b/>
-          <w:color w:val="1B365D"/>
-          <w:sz w:val="23"/>
+          <w:color w:val="0F172A"/>
+          <w:sz w:val="21"/>
         </w:rPr>
         <w:t>7. INVENTOR DECLARATION &amp; ENDORSEMENT</w:t>
       </w:r>
     </w:p>
     <w:p>
       <w:pPr>
-        <w:spacing w:after="160"/>
+        <w:spacing w:after="120"/>
       </w:pPr>
       <w:r>
         <w:t>I hereby declare that I am the true and first inventor of the technical subject matter described herein. No prior public disclosure, journal publication, or commercial sale has occurred prior to this submission, ensuring absolute novelty under Section 2(1)(j) of The Patents Act, 1970.</w:t>
@@ -1617,30 +1617,30 @@
         <w:jc w:val="center"/>
         <w:tblLook w:firstColumn="1" w:firstRow="1" w:lastColumn="0" w:lastRow="0" w:noHBand="0" w:noVBand="1" w:val="04A0"/>
         <w:tblBorders>
-          <w:top w:val="single" w:sz="4" w:space="0" w:color="CBD5E0"/>
-          <w:bottom w:val="single" w:sz="4" w:space="0" w:color="CBD5E0"/>
+          <w:top w:val="single" w:sz="4" w:space="0" w:color="E2E8F0"/>
+          <w:bottom w:val="single" w:sz="4" w:space="0" w:color="E2E8F0"/>
           <w:left w:val="none"/>
           <w:right w:val="none"/>
-          <w:insideH w:val="single" w:sz="4" w:space="0" w:color="CBD5E0"/>
+          <w:insideH w:val="single" w:sz="4" w:space="0" w:color="E2E8F0"/>
           <w:insideV w:val="none"/>
         </w:tblBorders>
       </w:tblPr>
       <w:tblGrid>
-        <w:gridCol w:w="1560"/>
-        <w:gridCol w:w="1560"/>
-        <w:gridCol w:w="1560"/>
-        <w:gridCol w:w="1560"/>
-        <w:gridCol w:w="1560"/>
-        <w:gridCol w:w="1560"/>
+        <w:gridCol w:w="1680"/>
+        <w:gridCol w:w="1680"/>
+        <w:gridCol w:w="1680"/>
+        <w:gridCol w:w="1680"/>
+        <w:gridCol w:w="1680"/>
+        <w:gridCol w:w="1680"/>
       </w:tblGrid>
       <w:tr>
         <w:tc>
           <w:tcPr>
-            <w:tcW w:type="dxa" w:w="1560"/>
-            <w:shd w:fill="2B6CB0"/>
+            <w:tcW w:type="dxa" w:w="1680"/>
+            <w:shd w:fill="0F172A"/>
             <w:tcMar>
-              <w:top w:w="80" w:type="dxa"/>
-              <w:bottom w:w="80" w:type="dxa"/>
+              <w:top w:w="60" w:type="dxa"/>
+              <w:bottom w:w="60" w:type="dxa"/>
               <w:left w:w="60" w:type="dxa"/>
               <w:right w:w="60" w:type="dxa"/>
             </w:tcMar>
@@ -1661,11 +1661,11 @@
         </w:tc>
         <w:tc>
           <w:tcPr>
-            <w:tcW w:type="dxa" w:w="1560"/>
-            <w:shd w:fill="2B6CB0"/>
+            <w:tcW w:type="dxa" w:w="1680"/>
+            <w:shd w:fill="0F172A"/>
             <w:tcMar>
-              <w:top w:w="80" w:type="dxa"/>
-              <w:bottom w:w="80" w:type="dxa"/>
+              <w:top w:w="60" w:type="dxa"/>
+              <w:bottom w:w="60" w:type="dxa"/>
               <w:left w:w="60" w:type="dxa"/>
               <w:right w:w="60" w:type="dxa"/>
             </w:tcMar>
@@ -1686,11 +1686,11 @@
         </w:tc>
         <w:tc>
           <w:tcPr>
-            <w:tcW w:type="dxa" w:w="1560"/>
-            <w:shd w:fill="2B6CB0"/>
+            <w:tcW w:type="dxa" w:w="1680"/>
+            <w:shd w:fill="0F172A"/>
             <w:tcMar>
-              <w:top w:w="80" w:type="dxa"/>
-              <w:bottom w:w="80" w:type="dxa"/>
+              <w:top w:w="60" w:type="dxa"/>
+              <w:bottom w:w="60" w:type="dxa"/>
               <w:left w:w="60" w:type="dxa"/>
               <w:right w:w="60" w:type="dxa"/>
             </w:tcMar>
@@ -1711,11 +1711,11 @@
         </w:tc>
         <w:tc>
           <w:tcPr>
-            <w:tcW w:type="dxa" w:w="1560"/>
-            <w:shd w:fill="2B6CB0"/>
+            <w:tcW w:type="dxa" w:w="1680"/>
+            <w:shd w:fill="0F172A"/>
             <w:tcMar>
-              <w:top w:w="80" w:type="dxa"/>
-              <w:bottom w:w="80" w:type="dxa"/>
+              <w:top w:w="60" w:type="dxa"/>
+              <w:bottom w:w="60" w:type="dxa"/>
               <w:left w:w="60" w:type="dxa"/>
               <w:right w:w="60" w:type="dxa"/>
             </w:tcMar>
@@ -1736,11 +1736,11 @@
         </w:tc>
         <w:tc>
           <w:tcPr>
-            <w:tcW w:type="dxa" w:w="1560"/>
-            <w:shd w:fill="2B6CB0"/>
+            <w:tcW w:type="dxa" w:w="1680"/>
+            <w:shd w:fill="0F172A"/>
             <w:tcMar>
-              <w:top w:w="80" w:type="dxa"/>
-              <w:bottom w:w="80" w:type="dxa"/>
+              <w:top w:w="60" w:type="dxa"/>
+              <w:bottom w:w="60" w:type="dxa"/>
               <w:left w:w="60" w:type="dxa"/>
               <w:right w:w="60" w:type="dxa"/>
             </w:tcMar>
@@ -1761,11 +1761,11 @@
         </w:tc>
         <w:tc>
           <w:tcPr>
-            <w:tcW w:type="dxa" w:w="1560"/>
-            <w:shd w:fill="2B6CB0"/>
+            <w:tcW w:type="dxa" w:w="1680"/>
+            <w:shd w:fill="0F172A"/>
             <w:tcMar>
-              <w:top w:w="80" w:type="dxa"/>
-              <w:bottom w:w="80" w:type="dxa"/>
+              <w:top w:w="60" w:type="dxa"/>
+              <w:bottom w:w="60" w:type="dxa"/>
               <w:left w:w="60" w:type="dxa"/>
               <w:right w:w="60" w:type="dxa"/>
             </w:tcMar>
@@ -1788,11 +1788,11 @@
       <w:tr>
         <w:tc>
           <w:tcPr>
-            <w:tcW w:type="dxa" w:w="1560"/>
-            <w:shd w:fill="F7FAFC"/>
+            <w:tcW w:type="dxa" w:w="1680"/>
+            <w:shd w:fill="F8FAFC"/>
             <w:tcMar>
-              <w:top w:w="80" w:type="dxa"/>
-              <w:bottom w:w="80" w:type="dxa"/>
+              <w:top w:w="60" w:type="dxa"/>
+              <w:bottom w:w="60" w:type="dxa"/>
               <w:left w:w="60" w:type="dxa"/>
               <w:right w:w="60" w:type="dxa"/>
             </w:tcMar>
@@ -1803,7 +1803,7 @@
             </w:pPr>
             <w:r>
               <w:rPr>
-                <w:color w:val="2D3748"/>
+                <w:color w:val="1E293B"/>
                 <w:sz w:val="16"/>
               </w:rPr>
               <w:t>Ankit Chetri</w:t>
@@ -1812,11 +1812,11 @@
         </w:tc>
         <w:tc>
           <w:tcPr>
-            <w:tcW w:type="dxa" w:w="1560"/>
-            <w:shd w:fill="F7FAFC"/>
+            <w:tcW w:type="dxa" w:w="1680"/>
+            <w:shd w:fill="F8FAFC"/>
             <w:tcMar>
-              <w:top w:w="80" w:type="dxa"/>
-              <w:bottom w:w="80" w:type="dxa"/>
+              <w:top w:w="60" w:type="dxa"/>
+              <w:bottom w:w="60" w:type="dxa"/>
               <w:left w:w="60" w:type="dxa"/>
               <w:right w:w="60" w:type="dxa"/>
             </w:tcMar>
@@ -1827,7 +1827,7 @@
             </w:pPr>
             <w:r>
               <w:rPr>
-                <w:color w:val="2D3748"/>
+                <w:color w:val="1E293B"/>
                 <w:sz w:val="16"/>
               </w:rPr>
               <w:t>Indian</w:t>
@@ -1836,11 +1836,11 @@
         </w:tc>
         <w:tc>
           <w:tcPr>
-            <w:tcW w:type="dxa" w:w="1560"/>
-            <w:shd w:fill="F7FAFC"/>
+            <w:tcW w:type="dxa" w:w="1680"/>
+            <w:shd w:fill="F8FAFC"/>
             <w:tcMar>
-              <w:top w:w="80" w:type="dxa"/>
-              <w:bottom w:w="80" w:type="dxa"/>
+              <w:top w:w="60" w:type="dxa"/>
+              <w:bottom w:w="60" w:type="dxa"/>
               <w:left w:w="60" w:type="dxa"/>
               <w:right w:w="60" w:type="dxa"/>
             </w:tcMar>
@@ -1851,7 +1851,7 @@
             </w:pPr>
             <w:r>
               <w:rPr>
-                <w:color w:val="2D3748"/>
+                <w:color w:val="1E293B"/>
                 <w:sz w:val="16"/>
               </w:rPr>
               <w:t>India</w:t>
@@ -1860,11 +1860,11 @@
         </w:tc>
         <w:tc>
           <w:tcPr>
-            <w:tcW w:type="dxa" w:w="1560"/>
-            <w:shd w:fill="F7FAFC"/>
+            <w:tcW w:type="dxa" w:w="1680"/>
+            <w:shd w:fill="F8FAFC"/>
             <w:tcMar>
-              <w:top w:w="80" w:type="dxa"/>
-              <w:bottom w:w="80" w:type="dxa"/>
+              <w:top w:w="60" w:type="dxa"/>
+              <w:bottom w:w="60" w:type="dxa"/>
               <w:left w:w="60" w:type="dxa"/>
               <w:right w:w="60" w:type="dxa"/>
             </w:tcMar>
@@ -1875,7 +1875,7 @@
             </w:pPr>
             <w:r>
               <w:rPr>
-                <w:color w:val="2D3748"/>
+                <w:color w:val="1E293B"/>
                 <w:sz w:val="16"/>
               </w:rPr>
               <w:t>Department of Computer Science &amp; Engineering (CSE),</w:t>
@@ -1886,11 +1886,11 @@
         </w:tc>
         <w:tc>
           <w:tcPr>
-            <w:tcW w:type="dxa" w:w="1560"/>
-            <w:shd w:fill="F7FAFC"/>
+            <w:tcW w:type="dxa" w:w="1680"/>
+            <w:shd w:fill="F8FAFC"/>
             <w:tcMar>
-              <w:top w:w="80" w:type="dxa"/>
-              <w:bottom w:w="80" w:type="dxa"/>
+              <w:top w:w="60" w:type="dxa"/>
+              <w:bottom w:w="60" w:type="dxa"/>
               <w:left w:w="60" w:type="dxa"/>
               <w:right w:w="60" w:type="dxa"/>
             </w:tcMar>
@@ -1901,7 +1901,7 @@
             </w:pPr>
             <w:r>
               <w:rPr>
-                <w:color w:val="2D3748"/>
+                <w:color w:val="1E293B"/>
                 <w:sz w:val="16"/>
               </w:rPr>
               <w:t>[Ankit Chetri]</w:t>
@@ -1910,11 +1910,11 @@
         </w:tc>
         <w:tc>
           <w:tcPr>
-            <w:tcW w:type="dxa" w:w="1560"/>
-            <w:shd w:fill="F7FAFC"/>
+            <w:tcW w:type="dxa" w:w="1680"/>
+            <w:shd w:fill="F8FAFC"/>
             <w:tcMar>
-              <w:top w:w="80" w:type="dxa"/>
-              <w:bottom w:w="80" w:type="dxa"/>
+              <w:top w:w="60" w:type="dxa"/>
+              <w:bottom w:w="60" w:type="dxa"/>
               <w:left w:w="60" w:type="dxa"/>
               <w:right w:w="60" w:type="dxa"/>
             </w:tcMar>
@@ -1925,7 +1925,7 @@
             </w:pPr>
             <w:r>
               <w:rPr>
-                <w:color w:val="2D3748"/>
+                <w:color w:val="1E293B"/>
                 <w:sz w:val="16"/>
               </w:rPr>
               <w:t>Male</w:t>
@@ -1936,7 +1936,7 @@
     </w:tbl>
     <w:sectPr>
       <w:pgSz w:w="12240" w:h="15840"/>
-      <w:pgMar w:top="1440" w:right="1440" w:bottom="1440" w:left="1440" w:header="720" w:footer="720" w:gutter="0"/>
+      <w:pgMar w:top="1080" w:right="1080" w:bottom="1080" w:left="1080" w:header="720" w:footer="720" w:gutter="0"/>
       <w:cols w:space="720"/>
       <w:docGrid w:linePitch="360"/>
     </w:sectPr>
@@ -2308,12 +2308,12 @@
     <w:qFormat/>
     <w:rsid w:val="00FC693F"/>
     <w:pPr>
-      <w:spacing w:line="276" w:lineRule="auto" w:after="80"/>
+      <w:spacing w:line="276" w:lineRule="auto" w:after="60"/>
     </w:pPr>
     <w:rPr>
       <w:rFonts w:ascii="Calibri" w:hAnsi="Calibri"/>
-      <w:color w:val="2D3748"/>
-      <w:sz w:val="20"/>
+      <w:color w:val="334155"/>
+      <w:sz w:val="19"/>
     </w:rPr>
   </w:style>
   <w:style w:type="paragraph" w:styleId="Header">

</xml_diff>

<commit_message>
docs(patent): synchronize all calibrated kinematic values across spec, docx, and SVG flowchart (480 counts latch, 20 counts/ms velocity, 85ms rebound window, 1200 override)
</commit_message>
<xml_diff>
--- a/docs/Meantendo_University_Patent_Submission.docx
+++ b/docs/Meantendo_University_Patent_Submission.docx
@@ -110,7 +110,58 @@
                 <w:color w:val="475569"/>
                 <w:sz w:val="17"/>
               </w:rPr>
-              <w:t>Ankit Chetri (Gender: Male)</w:t>
+              <w:t>Ankit Chetri</w:t>
+            </w:r>
+          </w:p>
+        </w:tc>
+      </w:tr>
+      <w:tr>
+        <w:tc>
+          <w:tcPr>
+            <w:tcW w:type="dxa" w:w="3168"/>
+            <w:shd w:fill="F8FAFC"/>
+            <w:tcMar>
+              <w:top w:w="60" w:type="dxa"/>
+              <w:bottom w:w="60" w:type="dxa"/>
+              <w:left w:w="100" w:type="dxa"/>
+              <w:right w:w="100" w:type="dxa"/>
+            </w:tcMar>
+          </w:tcPr>
+          <w:p>
+            <w:pPr>
+              <w:spacing w:after="0"/>
+            </w:pPr>
+            <w:r>
+              <w:rPr>
+                <w:b/>
+                <w:color w:val="1E293B"/>
+                <w:sz w:val="17"/>
+              </w:rPr>
+              <w:t>Gender</w:t>
+            </w:r>
+          </w:p>
+        </w:tc>
+        <w:tc>
+          <w:tcPr>
+            <w:tcW w:type="dxa" w:w="6912"/>
+            <w:shd w:fill="F8FAFC"/>
+            <w:tcMar>
+              <w:top w:w="60" w:type="dxa"/>
+              <w:bottom w:w="60" w:type="dxa"/>
+              <w:left w:w="100" w:type="dxa"/>
+              <w:right w:w="100" w:type="dxa"/>
+            </w:tcMar>
+          </w:tcPr>
+          <w:p>
+            <w:pPr>
+              <w:spacing w:after="0"/>
+            </w:pPr>
+            <w:r>
+              <w:rPr>
+                <w:color w:val="475569"/>
+                <w:sz w:val="17"/>
+              </w:rPr>
+              <w:t>Male</w:t>
             </w:r>
           </w:p>
         </w:tc>
@@ -144,7 +195,7 @@
         <w:tc>
           <w:tcPr>
             <w:tcW w:type="dxa" w:w="6912"/>
-            <w:shd w:fill="F8FAFC"/>
+            <w:shd w:fill="FFFFFF"/>
             <w:tcMar>
               <w:top w:w="60" w:type="dxa"/>
               <w:bottom w:w="60" w:type="dxa"/>
@@ -195,7 +246,7 @@
         <w:tc>
           <w:tcPr>
             <w:tcW w:type="dxa" w:w="6912"/>
-            <w:shd w:fill="FFFFFF"/>
+            <w:shd w:fill="F8FAFC"/>
             <w:tcMar>
               <w:top w:w="60" w:type="dxa"/>
               <w:bottom w:w="60" w:type="dxa"/>
@@ -246,7 +297,7 @@
         <w:tc>
           <w:tcPr>
             <w:tcW w:type="dxa" w:w="6912"/>
-            <w:shd w:fill="F8FAFC"/>
+            <w:shd w:fill="FFFFFF"/>
             <w:tcMar>
               <w:top w:w="60" w:type="dxa"/>
               <w:bottom w:w="60" w:type="dxa"/>
@@ -297,7 +348,7 @@
         <w:tc>
           <w:tcPr>
             <w:tcW w:type="dxa" w:w="6912"/>
-            <w:shd w:fill="FFFFFF"/>
+            <w:shd w:fill="F8FAFC"/>
             <w:tcMar>
               <w:top w:w="60" w:type="dxa"/>
               <w:bottom w:w="60" w:type="dxa"/>
@@ -348,7 +399,7 @@
         <w:tc>
           <w:tcPr>
             <w:tcW w:type="dxa" w:w="6912"/>
-            <w:shd w:fill="F8FAFC"/>
+            <w:shd w:fill="FFFFFF"/>
             <w:tcMar>
               <w:top w:w="60" w:type="dxa"/>
               <w:bottom w:w="60" w:type="dxa"/>
@@ -395,7 +446,7 @@
         <w:spacing w:line="276" w:lineRule="auto" w:after="120"/>
       </w:pPr>
       <w:r>
-        <w:t>An embedded interactive signal conditioning apparatus and deterministic telemetry architecture are disclosed that eliminate mechanical snapback overshoots on spring-biased analog potentiometric transducers while providing sub-2 millisecond physical RF airtime telemetry. The apparatus comprises a dual-axis spring-centered resistive transducer, an analog-to-digital converter (ADC), a graphic display coupled via a serial peripheral interface (SPI) bus, an RF transceiver, and a processing unit. The processing unit estimates real-time finite-difference kinematic displacement velocities of the transducer. Upon detecting a rapid return trajectory toward the neutral axis followed by an axis sign reversal into the opposing quadrant, an asymmetric directional damping filter suppresses opposing recoil to neutral center during a calibrated temporal window (20–50 ms) while preserving instantaneous zero-lag passthrough for operator-directed outward inputs. Conditioned coordinate matrices are serialized into fixed-length action frames and broadcast over an unassociated 802.11 channel with automated baseband channel-lock recovery, while display scanlines are composited using dual line buffers (640 bytes total) to free system RAM for concurrent RF baseband operations.</w:t>
+        <w:t>An embedded interactive signal conditioning apparatus and deterministic telemetry architecture are disclosed that eliminate mechanical snapback overshoots on spring-biased analog potentiometric transducers while providing sub-2 millisecond physical RF airtime telemetry. The apparatus comprises a dual-axis spring-centered resistive transducer, an analog-to-digital converter (ADC), a graphic display coupled via a serial peripheral interface (SPI) bus, an RF transceiver, and a processing unit. The processing unit estimates real-time finite-difference kinematic displacement velocities of the transducer. Upon detecting a rapid return trajectory toward the neutral axis followed by an axis sign reversal into the opposing quadrant, an asymmetric directional damping filter suppresses opposing recoil to neutral center during a calibrated temporal window (50–85 ms, nominal 85 ms) while preserving instantaneous zero-lag passthrough for operator-directed outward inputs. Conditioned coordinate matrices are serialized into fixed-length action frames and broadcast over an unassociated 802.11 channel with automated baseband channel-lock recovery, while display scanlines are composited using dual line buffers (640 bytes total) to free system RAM for concurrent RF baseband operations.</w:t>
       </w:r>
     </w:p>
     <w:p>
@@ -492,7 +543,7 @@
         <w:t>The present invention integrates four synergistic hardware and firmware mechanisms engineered from first principles:</w:t>
         <w:br/>
         <w:br/>
-        <w:t>1. Directional Asymmetric Kinematic Rebound Damping: The microcontroller computes discrete finite-difference velocity vectors v = (x[n] - x[n-1]) / dt at periodic sample intervals (dt = 1–16 ms). When stick deflection exceeds 800 counts from center, origin quadrant is latched. When the stick returns toward center with velocity exceeding 20 counts/ms, fast return is flagged. If coordinate travel crosses the deadzone into the opposite quadrant, rebound state is engaged for 50 ms, clamping coordinates to neutral 2048 to prevent false input, while outward operator force exceeding 1300 counts aborts suppression with 0 ms latency.</w:t>
+        <w:t>1. Directional Asymmetric Kinematic Rebound Damping: The microcontroller computes discrete finite-difference velocity vectors v = (x[n] - x[n-1]) / dt at periodic sample intervals (dt = 1–16 ms). When stick deflection exceeds 480 counts from center, origin quadrant is latched. When the stick returns toward center with velocity exceeding 20 counts/ms, fast return is flagged. If coordinate travel crosses the deadzone into the opposite quadrant, rebound state is engaged for 85 ms (calibrated duration covering mechanical spring recoil), clamping coordinates to neutral 2048 to prevent false input, while outward operator force exceeding 1200 counts aborts suppression with 0 ms latency.</w:t>
         <w:br/>
         <w:br/>
         <w:t>2. Synergistic Low-Latency Ad-Hoc RF Telemetry: Conditioned coordinates, tactile switch bitmasks, and interactive states are packed into a 20-byte action frame broadcast at 60 Hz on dedicated Channel 1 (2.412 GHz) with sub-2 millisecond physical airtime. A coexistence engine automatically purges IP network associations and re-locks Channel 1 after cloud roaming, ensuring deterministic wireless synchronization.</w:t>
@@ -523,7 +574,7 @@
         <w:t>The physical apparatus was benchmarked across multi-session operational cycles on operational hardware:</w:t>
         <w:br/>
         <w:br/>
-        <w:t>• Transducer Rebound Suppression: During rapid thumbstick flick tests (releasing the stick from maximum deflection ADC 4095), unfiltered spring recoil generated a reverse voltage spike reaching ADC 1200 (overshoot of 848 counts past center 2048). With the present invention active, the recoil trajectory was detected within 2 ms of deadzone entry, clamping coordinate output to neutral 2048 for 50 ms. Zero false reverse actuations occurred, and operator-initiated outward strokes experienced 0 ms added phase lag.</w:t>
+        <w:t>• Transducer Rebound Suppression: During rapid thumbstick flick tests (releasing the stick from maximum deflection ADC 4095), unfiltered spring recoil generated a reverse voltage spike reaching ADC 1200 (overshoot of 848 counts past center 2048). With the present invention active, the recoil trajectory was detected within 2 ms of deadzone entry, clamping coordinate output to neutral 2048 for 85 ms. Zero false reverse actuations occurred, and operator-initiated outward strokes experienced 0 ms added phase lag.</w:t>
         <w:br/>
         <w:br/>
         <w:t>• RF Telemetry Airtime: 60 Hz bidirectional telemetry exchange between primary handheld console and secondary companion node over dedicated Channel 1 demonstrated an average one-way physical airtime of 1.42 ms, well within the 16.7 ms frame deadline of a 60 Hz interactive loop.</w:t>
@@ -603,7 +654,7 @@
         <w:t xml:space="preserve">2. </w:t>
       </w:r>
       <w:r>
-        <w:t>The apparatus of claim 1, wherein said calibrated temporal rebound window (τ_r) is configured within a range of 20 milliseconds to 55 milliseconds.</w:t>
+        <w:t>The apparatus of claim 1, wherein said calibrated temporal rebound window (τ_r) is configured within a range of 20 milliseconds to 85 milliseconds (calibrated nominal duration: 85 milliseconds).</w:t>
       </w:r>
     </w:p>
     <w:p>
@@ -782,7 +833,7 @@
       <w:r>
         <w:drawing>
           <wp:inline xmlns:a="http://schemas.openxmlformats.org/drawingml/2006/main" xmlns:pic="http://schemas.openxmlformats.org/drawingml/2006/picture">
-            <wp:extent cx="6217920" cy="3997234"/>
+            <wp:extent cx="6217920" cy="3017520"/>
             <wp:docPr id="1" name="Picture 1"/>
             <wp:cNvGraphicFramePr>
               <a:graphicFrameLocks noChangeAspect="1"/>
@@ -803,7 +854,7 @@
                   <pic:spPr>
                     <a:xfrm>
                       <a:off x="0" y="0"/>
-                      <a:ext cx="6217920" cy="3997234"/>
+                      <a:ext cx="6217920" cy="3017520"/>
                     </a:xfrm>
                     <a:prstGeom prst="rect"/>
                   </pic:spPr>
@@ -1146,7 +1197,7 @@
                 <w:color w:val="64748B"/>
                 <w:sz w:val="14"/>
               </w:rPr>
-              <w:t>Diagnostic telemetry screen displaying real-time deflection velocity estimation, origin latching, and active 50ms directional recoil damping.</w:t>
+              <w:t>Diagnostic telemetry screen displaying real-time deflection velocity estimation, origin latching, and active 85ms directional recoil damping.</w:t>
             </w:r>
           </w:p>
         </w:tc>

</xml_diff>